<commit_message>
feat: LAB 7 30-04-2026
</commit_message>
<xml_diff>
--- a/LAB 4/Lab 4 book print.docx
+++ b/LAB 4/Lab 4 book print.docx
@@ -5,133 +5,91 @@
     <w:p>
       <w:pPr>
         <w:rPr>
+          <w:b/>
+          <w:bCs/>
           <w:sz w:val="32"/>
           <w:szCs w:val="32"/>
         </w:rPr>
       </w:pPr>
-      <w:r>
+    </w:p>
+    <w:p>
+      <w:pPr>
         <w:rPr>
           <w:b/>
           <w:bCs/>
           <w:sz w:val="32"/>
           <w:szCs w:val="32"/>
         </w:rPr>
-        <w:t xml:space="preserve">Lab </w:t>
-      </w:r>
-      <w:r>
+      </w:pPr>
+    </w:p>
+    <w:p>
+      <w:pPr>
         <w:rPr>
           <w:b/>
           <w:bCs/>
           <w:sz w:val="32"/>
           <w:szCs w:val="32"/>
         </w:rPr>
-        <w:t>3</w:t>
+      </w:pPr>
+    </w:p>
+    <w:p>
+      <w:pPr>
+        <w:rPr>
+          <w:b/>
+          <w:bCs/>
+          <w:sz w:val="32"/>
+          <w:szCs w:val="32"/>
+        </w:rPr>
+      </w:pPr>
+    </w:p>
+    <w:p>
+      <w:pPr>
+        <w:rPr>
+          <w:b/>
+          <w:bCs/>
+          <w:sz w:val="32"/>
+          <w:szCs w:val="32"/>
+        </w:rPr>
+      </w:pPr>
+      <w:r>
+        <w:rPr>
+          <w:b/>
+          <w:bCs/>
+          <w:sz w:val="32"/>
+          <w:szCs w:val="32"/>
+        </w:rPr>
+        <w:t xml:space="preserve">OUTPUT: </w:t>
       </w:r>
     </w:p>
     <w:p>
       <w:pPr>
         <w:rPr>
-          <w:sz w:val="28"/>
-          <w:szCs w:val="28"/>
-        </w:rPr>
-      </w:pPr>
-    </w:p>
-    <w:p>
-      <w:pPr>
-        <w:pStyle w:val="ListParagraph"/>
-        <w:numPr>
-          <w:ilvl w:val="0"/>
-          <w:numId w:val="25"/>
-        </w:numPr>
-        <w:rPr>
-          <w:sz w:val="28"/>
-          <w:szCs w:val="28"/>
+          <w:b/>
+          <w:bCs/>
+          <w:sz w:val="32"/>
+          <w:szCs w:val="32"/>
         </w:rPr>
       </w:pPr>
       <w:r>
         <w:rPr>
           <w:b/>
           <w:bCs/>
-          <w:sz w:val="28"/>
-          <w:szCs w:val="28"/>
-        </w:rPr>
-        <w:t>8-Queens: All Solutions + Board Visualization</w:t>
-      </w:r>
-      <w:r>
-        <w:rPr>
-          <w:b/>
-          <w:bCs/>
-          <w:sz w:val="28"/>
-          <w:szCs w:val="28"/>
-        </w:rPr>
-        <w:br/>
-      </w:r>
-      <w:r>
-        <w:rPr>
-          <w:b/>
-          <w:bCs/>
-          <w:sz w:val="28"/>
-          <w:szCs w:val="28"/>
-        </w:rPr>
-        <w:br/>
-      </w:r>
-      <w:r>
-        <w:rPr>
-          <w:sz w:val="28"/>
-          <w:szCs w:val="28"/>
-        </w:rPr>
-        <w:t>Write a Python program to solve the 8-Queens problem using backtracking and print all 92 solutions. Add a board visualization to your solution — print the</w:t>
-      </w:r>
-      <w:r>
-        <w:rPr>
-          <w:sz w:val="28"/>
-          <w:szCs w:val="28"/>
-        </w:rPr>
-        <w:br/>
-        <w:t xml:space="preserve">chessboard using Q for queens </w:t>
-      </w:r>
-      <w:proofErr w:type="gramStart"/>
-      <w:r>
-        <w:rPr>
-          <w:sz w:val="28"/>
-          <w:szCs w:val="28"/>
-        </w:rPr>
-        <w:t>and .</w:t>
-      </w:r>
-      <w:proofErr w:type="gramEnd"/>
-      <w:r>
-        <w:rPr>
-          <w:sz w:val="28"/>
-          <w:szCs w:val="28"/>
-        </w:rPr>
-        <w:t xml:space="preserve"> for empty cells.</w:t>
-      </w:r>
-    </w:p>
-    <w:p>
-      <w:pPr>
-        <w:pStyle w:val="ListParagraph"/>
-        <w:rPr>
-          <w:noProof/>
-        </w:rPr>
-      </w:pPr>
-      <w:r>
-        <w:rPr>
-          <w:sz w:val="28"/>
-          <w:szCs w:val="28"/>
+          <w:sz w:val="32"/>
+          <w:szCs w:val="32"/>
         </w:rPr>
         <w:drawing>
-          <wp:anchor distT="0" distB="0" distL="114300" distR="114300" simplePos="0" relativeHeight="251658240" behindDoc="0" locked="0" layoutInCell="1" allowOverlap="1" wp14:anchorId="723D620E" wp14:editId="1E323B80">
+          <wp:anchor distT="0" distB="0" distL="114300" distR="114300" simplePos="0" relativeHeight="251671552" behindDoc="0" locked="0" layoutInCell="1" allowOverlap="1" wp14:anchorId="61FC3423" wp14:editId="4C630C61">
             <wp:simplePos x="0" y="0"/>
             <wp:positionH relativeFrom="margin">
-              <wp:align>left</wp:align>
+              <wp:align>right</wp:align>
             </wp:positionH>
             <wp:positionV relativeFrom="paragraph">
-              <wp:posOffset>111760</wp:posOffset>
+              <wp:posOffset>352516</wp:posOffset>
             </wp:positionV>
-            <wp:extent cx="5910367" cy="5851525"/>
-            <wp:effectExtent l="0" t="0" r="0" b="0"/>
+            <wp:extent cx="6302829" cy="3401644"/>
+            <wp:effectExtent l="0" t="0" r="3175" b="8890"/>
             <wp:wrapNone/>
-            <wp:docPr id="1683940252" name="Picture 1"/>
+            <wp:docPr id="863613430" name="Picture 1"/>
             <wp:cNvGraphicFramePr>
               <a:graphicFrameLocks xmlns:a="http://schemas.openxmlformats.org/drawingml/2006/main" noChangeAspect="1"/>
             </wp:cNvGraphicFramePr>
@@ -139,7 +97,7 @@
               <a:graphicData uri="http://schemas.openxmlformats.org/drawingml/2006/picture">
                 <pic:pic xmlns:pic="http://schemas.openxmlformats.org/drawingml/2006/picture">
                   <pic:nvPicPr>
-                    <pic:cNvPr id="1683940252" name=""/>
+                    <pic:cNvPr id="863613430" name=""/>
                     <pic:cNvPicPr/>
                   </pic:nvPicPr>
                   <pic:blipFill>
@@ -157,7 +115,7 @@
                   <pic:spPr>
                     <a:xfrm>
                       <a:off x="0" y="0"/>
-                      <a:ext cx="5910367" cy="5851525"/>
+                      <a:ext cx="6302829" cy="3401644"/>
                     </a:xfrm>
                     <a:prstGeom prst="rect">
                       <a:avLst/>
@@ -175,195 +133,6 @@
     </w:p>
     <w:p>
       <w:pPr>
-        <w:pStyle w:val="ListParagraph"/>
-        <w:rPr>
-          <w:sz w:val="28"/>
-          <w:szCs w:val="28"/>
-        </w:rPr>
-      </w:pPr>
-    </w:p>
-    <w:p>
-      <w:pPr>
-        <w:pStyle w:val="ListParagraph"/>
-        <w:rPr>
-          <w:sz w:val="28"/>
-          <w:szCs w:val="28"/>
-        </w:rPr>
-      </w:pPr>
-    </w:p>
-    <w:p>
-      <w:pPr>
-        <w:pStyle w:val="ListParagraph"/>
-        <w:rPr>
-          <w:sz w:val="28"/>
-          <w:szCs w:val="28"/>
-        </w:rPr>
-      </w:pPr>
-    </w:p>
-    <w:p>
-      <w:pPr>
-        <w:pStyle w:val="ListParagraph"/>
-        <w:rPr>
-          <w:sz w:val="28"/>
-          <w:szCs w:val="28"/>
-        </w:rPr>
-      </w:pPr>
-    </w:p>
-    <w:p>
-      <w:pPr>
-        <w:pStyle w:val="ListParagraph"/>
-        <w:rPr>
-          <w:sz w:val="28"/>
-          <w:szCs w:val="28"/>
-        </w:rPr>
-      </w:pPr>
-    </w:p>
-    <w:p>
-      <w:pPr>
-        <w:pStyle w:val="ListParagraph"/>
-        <w:rPr>
-          <w:sz w:val="28"/>
-          <w:szCs w:val="28"/>
-        </w:rPr>
-      </w:pPr>
-    </w:p>
-    <w:p>
-      <w:pPr>
-        <w:pStyle w:val="ListParagraph"/>
-        <w:rPr>
-          <w:sz w:val="28"/>
-          <w:szCs w:val="28"/>
-        </w:rPr>
-      </w:pPr>
-    </w:p>
-    <w:p>
-      <w:pPr>
-        <w:pStyle w:val="ListParagraph"/>
-        <w:rPr>
-          <w:sz w:val="28"/>
-          <w:szCs w:val="28"/>
-        </w:rPr>
-      </w:pPr>
-    </w:p>
-    <w:p>
-      <w:pPr>
-        <w:pStyle w:val="ListParagraph"/>
-        <w:rPr>
-          <w:sz w:val="28"/>
-          <w:szCs w:val="28"/>
-        </w:rPr>
-      </w:pPr>
-    </w:p>
-    <w:p>
-      <w:pPr>
-        <w:pStyle w:val="ListParagraph"/>
-        <w:rPr>
-          <w:sz w:val="28"/>
-          <w:szCs w:val="28"/>
-        </w:rPr>
-      </w:pPr>
-    </w:p>
-    <w:p>
-      <w:pPr>
-        <w:pStyle w:val="ListParagraph"/>
-        <w:rPr>
-          <w:sz w:val="28"/>
-          <w:szCs w:val="28"/>
-        </w:rPr>
-      </w:pPr>
-    </w:p>
-    <w:p>
-      <w:pPr>
-        <w:pStyle w:val="ListParagraph"/>
-        <w:rPr>
-          <w:sz w:val="28"/>
-          <w:szCs w:val="28"/>
-        </w:rPr>
-      </w:pPr>
-    </w:p>
-    <w:p>
-      <w:pPr>
-        <w:pStyle w:val="ListParagraph"/>
-        <w:rPr>
-          <w:sz w:val="28"/>
-          <w:szCs w:val="28"/>
-        </w:rPr>
-      </w:pPr>
-    </w:p>
-    <w:p>
-      <w:pPr>
-        <w:pStyle w:val="ListParagraph"/>
-        <w:rPr>
-          <w:sz w:val="28"/>
-          <w:szCs w:val="28"/>
-        </w:rPr>
-      </w:pPr>
-    </w:p>
-    <w:p>
-      <w:pPr>
-        <w:pStyle w:val="ListParagraph"/>
-        <w:rPr>
-          <w:sz w:val="28"/>
-          <w:szCs w:val="28"/>
-        </w:rPr>
-      </w:pPr>
-    </w:p>
-    <w:p>
-      <w:pPr>
-        <w:pStyle w:val="ListParagraph"/>
-        <w:rPr>
-          <w:sz w:val="28"/>
-          <w:szCs w:val="28"/>
-        </w:rPr>
-      </w:pPr>
-    </w:p>
-    <w:p>
-      <w:pPr>
-        <w:pStyle w:val="ListParagraph"/>
-        <w:rPr>
-          <w:sz w:val="28"/>
-          <w:szCs w:val="28"/>
-        </w:rPr>
-      </w:pPr>
-    </w:p>
-    <w:p>
-      <w:pPr>
-        <w:pStyle w:val="ListParagraph"/>
-        <w:rPr>
-          <w:sz w:val="28"/>
-          <w:szCs w:val="28"/>
-        </w:rPr>
-      </w:pPr>
-    </w:p>
-    <w:p>
-      <w:pPr>
-        <w:pStyle w:val="ListParagraph"/>
-        <w:rPr>
-          <w:sz w:val="28"/>
-          <w:szCs w:val="28"/>
-        </w:rPr>
-      </w:pPr>
-    </w:p>
-    <w:p>
-      <w:pPr>
-        <w:pStyle w:val="ListParagraph"/>
-        <w:rPr>
-          <w:sz w:val="28"/>
-          <w:szCs w:val="28"/>
-        </w:rPr>
-      </w:pPr>
-    </w:p>
-    <w:p>
-      <w:pPr>
-        <w:pStyle w:val="ListParagraph"/>
-        <w:rPr>
-          <w:sz w:val="28"/>
-          <w:szCs w:val="28"/>
-        </w:rPr>
-      </w:pPr>
-    </w:p>
-    <w:p>
-      <w:pPr>
         <w:rPr>
           <w:b/>
           <w:bCs/>
@@ -381,95 +150,477 @@
           <w:szCs w:val="32"/>
         </w:rPr>
       </w:pPr>
-      <w:r>
+    </w:p>
+    <w:p>
+      <w:pPr>
         <w:rPr>
           <w:b/>
           <w:bCs/>
           <w:sz w:val="32"/>
           <w:szCs w:val="32"/>
         </w:rPr>
-        <w:lastRenderedPageBreak/>
+      </w:pPr>
+    </w:p>
+    <w:p>
+      <w:pPr>
+        <w:rPr>
+          <w:b/>
+          <w:bCs/>
+          <w:sz w:val="32"/>
+          <w:szCs w:val="32"/>
+        </w:rPr>
+      </w:pPr>
+    </w:p>
+    <w:p>
+      <w:pPr>
+        <w:rPr>
+          <w:b/>
+          <w:bCs/>
+          <w:sz w:val="32"/>
+          <w:szCs w:val="32"/>
+        </w:rPr>
+      </w:pPr>
+    </w:p>
+    <w:p>
+      <w:pPr>
+        <w:rPr>
+          <w:b/>
+          <w:bCs/>
+          <w:sz w:val="32"/>
+          <w:szCs w:val="32"/>
+        </w:rPr>
+      </w:pPr>
+    </w:p>
+    <w:p>
+      <w:pPr>
+        <w:rPr>
+          <w:b/>
+          <w:bCs/>
+          <w:sz w:val="32"/>
+          <w:szCs w:val="32"/>
+        </w:rPr>
+      </w:pPr>
+    </w:p>
+    <w:p>
+      <w:pPr>
+        <w:rPr>
+          <w:b/>
+          <w:bCs/>
+          <w:sz w:val="32"/>
+          <w:szCs w:val="32"/>
+        </w:rPr>
+      </w:pPr>
+    </w:p>
+    <w:p>
+      <w:pPr>
+        <w:rPr>
+          <w:b/>
+          <w:bCs/>
+          <w:sz w:val="32"/>
+          <w:szCs w:val="32"/>
+        </w:rPr>
+      </w:pPr>
+    </w:p>
+    <w:p>
+      <w:pPr>
+        <w:rPr>
+          <w:b/>
+          <w:bCs/>
+          <w:sz w:val="32"/>
+          <w:szCs w:val="32"/>
+        </w:rPr>
+      </w:pPr>
+    </w:p>
+    <w:p>
+      <w:pPr>
+        <w:rPr>
+          <w:b/>
+          <w:bCs/>
+          <w:sz w:val="32"/>
+          <w:szCs w:val="32"/>
+        </w:rPr>
+      </w:pPr>
+    </w:p>
+    <w:p>
+      <w:pPr>
+        <w:rPr>
+          <w:b/>
+          <w:bCs/>
+          <w:sz w:val="32"/>
+          <w:szCs w:val="32"/>
+        </w:rPr>
+      </w:pPr>
+    </w:p>
+    <w:p>
+      <w:pPr>
+        <w:rPr>
+          <w:b/>
+          <w:bCs/>
+          <w:sz w:val="32"/>
+          <w:szCs w:val="32"/>
+        </w:rPr>
+      </w:pPr>
+    </w:p>
+    <w:p>
+      <w:pPr>
+        <w:rPr>
+          <w:b/>
+          <w:bCs/>
+          <w:sz w:val="32"/>
+          <w:szCs w:val="32"/>
+        </w:rPr>
+      </w:pPr>
+    </w:p>
+    <w:p>
+      <w:pPr>
+        <w:rPr>
+          <w:b/>
+          <w:bCs/>
+          <w:sz w:val="32"/>
+          <w:szCs w:val="32"/>
+        </w:rPr>
+      </w:pPr>
+    </w:p>
+    <w:p>
+      <w:pPr>
+        <w:rPr>
+          <w:b/>
+          <w:bCs/>
+          <w:sz w:val="32"/>
+          <w:szCs w:val="32"/>
+        </w:rPr>
+      </w:pPr>
+    </w:p>
+    <w:p>
+      <w:pPr>
+        <w:rPr>
+          <w:b/>
+          <w:bCs/>
+          <w:sz w:val="32"/>
+          <w:szCs w:val="32"/>
+        </w:rPr>
+      </w:pPr>
+    </w:p>
+    <w:p>
+      <w:pPr>
+        <w:rPr>
+          <w:b/>
+          <w:bCs/>
+          <w:sz w:val="32"/>
+          <w:szCs w:val="32"/>
+        </w:rPr>
+      </w:pPr>
+    </w:p>
+    <w:p>
+      <w:pPr>
+        <w:rPr>
+          <w:b/>
+          <w:bCs/>
+          <w:sz w:val="32"/>
+          <w:szCs w:val="32"/>
+        </w:rPr>
+      </w:pPr>
+    </w:p>
+    <w:p>
+      <w:pPr>
+        <w:rPr>
+          <w:b/>
+          <w:bCs/>
+          <w:sz w:val="32"/>
+          <w:szCs w:val="32"/>
+        </w:rPr>
+      </w:pPr>
+    </w:p>
+    <w:p>
+      <w:pPr>
+        <w:rPr>
+          <w:b/>
+          <w:bCs/>
+          <w:sz w:val="32"/>
+          <w:szCs w:val="32"/>
+        </w:rPr>
+      </w:pPr>
+    </w:p>
+    <w:p>
+      <w:pPr>
+        <w:rPr>
+          <w:b/>
+          <w:bCs/>
+          <w:sz w:val="32"/>
+          <w:szCs w:val="32"/>
+        </w:rPr>
+      </w:pPr>
+    </w:p>
+    <w:p>
+      <w:pPr>
+        <w:rPr>
+          <w:b/>
+          <w:bCs/>
+          <w:sz w:val="32"/>
+          <w:szCs w:val="32"/>
+        </w:rPr>
+      </w:pPr>
+    </w:p>
+    <w:p>
+      <w:pPr>
+        <w:rPr>
+          <w:b/>
+          <w:bCs/>
+          <w:sz w:val="32"/>
+          <w:szCs w:val="32"/>
+        </w:rPr>
+      </w:pPr>
+    </w:p>
+    <w:p>
+      <w:pPr>
+        <w:rPr>
+          <w:b/>
+          <w:bCs/>
+          <w:sz w:val="32"/>
+          <w:szCs w:val="32"/>
+        </w:rPr>
+      </w:pPr>
+    </w:p>
+    <w:p>
+      <w:pPr>
+        <w:rPr>
+          <w:b/>
+          <w:bCs/>
+          <w:sz w:val="32"/>
+          <w:szCs w:val="32"/>
+        </w:rPr>
+      </w:pPr>
+    </w:p>
+    <w:p>
+      <w:pPr>
+        <w:rPr>
+          <w:b/>
+          <w:bCs/>
+          <w:sz w:val="32"/>
+          <w:szCs w:val="32"/>
+        </w:rPr>
+      </w:pPr>
+    </w:p>
+    <w:p>
+      <w:pPr>
+        <w:rPr>
+          <w:b/>
+          <w:bCs/>
+          <w:sz w:val="32"/>
+          <w:szCs w:val="32"/>
+        </w:rPr>
+      </w:pPr>
+    </w:p>
+    <w:p>
+      <w:pPr>
+        <w:rPr>
+          <w:b/>
+          <w:bCs/>
+          <w:sz w:val="32"/>
+          <w:szCs w:val="32"/>
+        </w:rPr>
+      </w:pPr>
+    </w:p>
+    <w:p>
+      <w:pPr>
+        <w:rPr>
+          <w:b/>
+          <w:bCs/>
+          <w:sz w:val="32"/>
+          <w:szCs w:val="32"/>
+        </w:rPr>
+      </w:pPr>
+    </w:p>
+    <w:p>
+      <w:pPr>
+        <w:rPr>
+          <w:b/>
+          <w:bCs/>
+          <w:sz w:val="32"/>
+          <w:szCs w:val="32"/>
+        </w:rPr>
+      </w:pPr>
+    </w:p>
+    <w:p>
+      <w:pPr>
+        <w:rPr>
+          <w:b/>
+          <w:bCs/>
+          <w:sz w:val="32"/>
+          <w:szCs w:val="32"/>
+        </w:rPr>
+      </w:pPr>
+    </w:p>
+    <w:p>
+      <w:pPr>
+        <w:rPr>
+          <w:b/>
+          <w:bCs/>
+          <w:sz w:val="32"/>
+          <w:szCs w:val="32"/>
+        </w:rPr>
+      </w:pPr>
+    </w:p>
+    <w:p>
+      <w:pPr>
+        <w:rPr>
+          <w:b/>
+          <w:bCs/>
+          <w:sz w:val="32"/>
+          <w:szCs w:val="32"/>
+        </w:rPr>
+      </w:pPr>
+    </w:p>
+    <w:p>
+      <w:pPr>
+        <w:rPr>
+          <w:b/>
+          <w:bCs/>
+          <w:sz w:val="32"/>
+          <w:szCs w:val="32"/>
+        </w:rPr>
+      </w:pPr>
+    </w:p>
+    <w:p>
+      <w:pPr>
+        <w:rPr>
+          <w:b/>
+          <w:bCs/>
+          <w:sz w:val="32"/>
+          <w:szCs w:val="32"/>
+        </w:rPr>
+      </w:pPr>
+    </w:p>
+    <w:p>
+      <w:pPr>
+        <w:rPr>
+          <w:b/>
+          <w:bCs/>
+          <w:sz w:val="32"/>
+          <w:szCs w:val="32"/>
+        </w:rPr>
+      </w:pPr>
+    </w:p>
+    <w:p>
+      <w:pPr>
+        <w:rPr>
+          <w:sz w:val="32"/>
+          <w:szCs w:val="32"/>
+        </w:rPr>
+      </w:pPr>
+      <w:r>
+        <w:rPr>
+          <w:b/>
+          <w:bCs/>
+          <w:sz w:val="32"/>
+          <w:szCs w:val="32"/>
+        </w:rPr>
+        <w:t xml:space="preserve">Lab </w:t>
+      </w:r>
+      <w:r>
+        <w:rPr>
+          <w:b/>
+          <w:bCs/>
+          <w:sz w:val="32"/>
+          <w:szCs w:val="32"/>
+        </w:rPr>
+        <w:t>4</w:t>
+      </w:r>
+    </w:p>
+    <w:p>
+      <w:pPr>
+        <w:rPr>
+          <w:sz w:val="28"/>
+          <w:szCs w:val="28"/>
+        </w:rPr>
+      </w:pPr>
+    </w:p>
+    <w:p>
+      <w:pPr>
+        <w:pStyle w:val="ListParagraph"/>
+        <w:numPr>
+          <w:ilvl w:val="0"/>
+          <w:numId w:val="25"/>
+        </w:numPr>
+        <w:rPr>
+          <w:sz w:val="28"/>
+          <w:szCs w:val="28"/>
+        </w:rPr>
+      </w:pPr>
+      <w:r>
+        <w:rPr>
+          <w:b/>
+          <w:bCs/>
+          <w:sz w:val="28"/>
+          <w:szCs w:val="28"/>
+        </w:rPr>
+        <w:t>DFS Traversal &amp; Tree on a Given Graph</w:t>
+      </w:r>
+      <w:r>
+        <w:rPr>
+          <w:b/>
+          <w:bCs/>
+          <w:sz w:val="28"/>
+          <w:szCs w:val="28"/>
+        </w:rPr>
         <w:br/>
       </w:r>
-    </w:p>
-    <w:p>
-      <w:pPr>
-        <w:rPr>
-          <w:b/>
-          <w:bCs/>
-          <w:sz w:val="32"/>
-          <w:szCs w:val="32"/>
-        </w:rPr>
-      </w:pPr>
-    </w:p>
-    <w:p>
-      <w:pPr>
-        <w:rPr>
-          <w:b/>
-          <w:bCs/>
-          <w:sz w:val="32"/>
-          <w:szCs w:val="32"/>
-        </w:rPr>
-      </w:pPr>
-    </w:p>
-    <w:p>
-      <w:pPr>
-        <w:rPr>
-          <w:b/>
-          <w:bCs/>
-          <w:sz w:val="32"/>
-          <w:szCs w:val="32"/>
-        </w:rPr>
-      </w:pPr>
-    </w:p>
-    <w:p>
-      <w:pPr>
-        <w:rPr>
-          <w:b/>
-          <w:bCs/>
-          <w:sz w:val="32"/>
-          <w:szCs w:val="32"/>
-        </w:rPr>
-      </w:pPr>
       <w:r>
         <w:rPr>
           <w:b/>
           <w:bCs/>
-          <w:sz w:val="32"/>
-          <w:szCs w:val="32"/>
-        </w:rPr>
-        <w:t xml:space="preserve">OUTPUT: </w:t>
+          <w:sz w:val="28"/>
+          <w:szCs w:val="28"/>
+        </w:rPr>
+        <w:br/>
       </w:r>
-    </w:p>
-    <w:p>
-      <w:pPr>
-        <w:rPr>
-          <w:b/>
-          <w:bCs/>
-          <w:sz w:val="32"/>
-          <w:szCs w:val="32"/>
-        </w:rPr>
-      </w:pPr>
       <w:r>
         <w:rPr>
-          <w:b/>
-          <w:bCs/>
-          <w:sz w:val="32"/>
-          <w:szCs w:val="32"/>
+          <w:sz w:val="28"/>
+          <w:szCs w:val="28"/>
+        </w:rPr>
+        <w:t xml:space="preserve">Perform DFS on the given graph starting from Node 0. Print the order in which nodes are visited. Also show the DFS tree by printing each </w:t>
+      </w:r>
+      <w:r>
+        <w:rPr>
+          <w:sz w:val="28"/>
+          <w:szCs w:val="28"/>
+        </w:rPr>
+        <w:br/>
+        <w:t>node and its parent (</w:t>
+      </w:r>
+      <w:r>
+        <w:rPr>
+          <w:sz w:val="28"/>
+          <w:szCs w:val="28"/>
+        </w:rPr>
+        <w:t>e.g. 0-&gt;1-&gt;3)</w:t>
+      </w:r>
+    </w:p>
+    <w:p>
+      <w:pPr>
+        <w:pStyle w:val="ListParagraph"/>
+        <w:rPr>
+          <w:noProof/>
+        </w:rPr>
+      </w:pPr>
+      <w:r>
+        <w:rPr>
+          <w:noProof/>
         </w:rPr>
         <w:drawing>
-          <wp:anchor distT="0" distB="0" distL="114300" distR="114300" simplePos="0" relativeHeight="251659264" behindDoc="0" locked="0" layoutInCell="1" allowOverlap="1" wp14:anchorId="53A3ADEC" wp14:editId="54158C14">
+          <wp:anchor distT="0" distB="0" distL="114300" distR="114300" simplePos="0" relativeHeight="251670528" behindDoc="0" locked="0" layoutInCell="1" allowOverlap="1" wp14:anchorId="362124AA" wp14:editId="7F8618E5">
             <wp:simplePos x="0" y="0"/>
             <wp:positionH relativeFrom="margin">
-              <wp:posOffset>-402772</wp:posOffset>
+              <wp:posOffset>751114</wp:posOffset>
             </wp:positionH>
             <wp:positionV relativeFrom="paragraph">
-              <wp:posOffset>413204</wp:posOffset>
+              <wp:posOffset>104140</wp:posOffset>
             </wp:positionV>
-            <wp:extent cx="6803571" cy="4299585"/>
-            <wp:effectExtent l="0" t="0" r="0" b="5715"/>
+            <wp:extent cx="4434454" cy="6023610"/>
+            <wp:effectExtent l="0" t="0" r="4445" b="0"/>
             <wp:wrapNone/>
-            <wp:docPr id="487621428" name="Picture 1"/>
+            <wp:docPr id="862404801" name="Picture 1"/>
             <wp:cNvGraphicFramePr>
               <a:graphicFrameLocks xmlns:a="http://schemas.openxmlformats.org/drawingml/2006/main" noChangeAspect="1"/>
             </wp:cNvGraphicFramePr>
@@ -477,7 +628,7 @@
               <a:graphicData uri="http://schemas.openxmlformats.org/drawingml/2006/picture">
                 <pic:pic xmlns:pic="http://schemas.openxmlformats.org/drawingml/2006/picture">
                   <pic:nvPicPr>
-                    <pic:cNvPr id="487621428" name=""/>
+                    <pic:cNvPr id="862404801" name=""/>
                     <pic:cNvPicPr/>
                   </pic:nvPicPr>
                   <pic:blipFill>
@@ -495,7 +646,321 @@
                   <pic:spPr>
                     <a:xfrm>
                       <a:off x="0" y="0"/>
-                      <a:ext cx="6806953" cy="4301722"/>
+                      <a:ext cx="4434703" cy="6023948"/>
+                    </a:xfrm>
+                    <a:prstGeom prst="rect">
+                      <a:avLst/>
+                    </a:prstGeom>
+                  </pic:spPr>
+                </pic:pic>
+              </a:graphicData>
+            </a:graphic>
+            <wp14:sizeRelV relativeFrom="margin">
+              <wp14:pctHeight>0</wp14:pctHeight>
+            </wp14:sizeRelV>
+          </wp:anchor>
+        </w:drawing>
+      </w:r>
+    </w:p>
+    <w:p>
+      <w:pPr>
+        <w:pStyle w:val="ListParagraph"/>
+        <w:rPr>
+          <w:sz w:val="28"/>
+          <w:szCs w:val="28"/>
+        </w:rPr>
+      </w:pPr>
+    </w:p>
+    <w:p>
+      <w:pPr>
+        <w:pStyle w:val="ListParagraph"/>
+        <w:rPr>
+          <w:sz w:val="28"/>
+          <w:szCs w:val="28"/>
+        </w:rPr>
+      </w:pPr>
+    </w:p>
+    <w:p>
+      <w:pPr>
+        <w:pStyle w:val="ListParagraph"/>
+        <w:rPr>
+          <w:sz w:val="28"/>
+          <w:szCs w:val="28"/>
+        </w:rPr>
+      </w:pPr>
+    </w:p>
+    <w:p>
+      <w:pPr>
+        <w:pStyle w:val="ListParagraph"/>
+        <w:rPr>
+          <w:sz w:val="28"/>
+          <w:szCs w:val="28"/>
+        </w:rPr>
+      </w:pPr>
+    </w:p>
+    <w:p>
+      <w:pPr>
+        <w:pStyle w:val="ListParagraph"/>
+        <w:rPr>
+          <w:sz w:val="28"/>
+          <w:szCs w:val="28"/>
+        </w:rPr>
+      </w:pPr>
+    </w:p>
+    <w:p>
+      <w:pPr>
+        <w:pStyle w:val="ListParagraph"/>
+        <w:rPr>
+          <w:sz w:val="28"/>
+          <w:szCs w:val="28"/>
+        </w:rPr>
+      </w:pPr>
+    </w:p>
+    <w:p>
+      <w:pPr>
+        <w:pStyle w:val="ListParagraph"/>
+        <w:rPr>
+          <w:sz w:val="28"/>
+          <w:szCs w:val="28"/>
+        </w:rPr>
+      </w:pPr>
+    </w:p>
+    <w:p>
+      <w:pPr>
+        <w:pStyle w:val="ListParagraph"/>
+        <w:rPr>
+          <w:sz w:val="28"/>
+          <w:szCs w:val="28"/>
+        </w:rPr>
+      </w:pPr>
+    </w:p>
+    <w:p>
+      <w:pPr>
+        <w:pStyle w:val="ListParagraph"/>
+        <w:rPr>
+          <w:sz w:val="28"/>
+          <w:szCs w:val="28"/>
+        </w:rPr>
+      </w:pPr>
+    </w:p>
+    <w:p>
+      <w:pPr>
+        <w:pStyle w:val="ListParagraph"/>
+        <w:rPr>
+          <w:sz w:val="28"/>
+          <w:szCs w:val="28"/>
+        </w:rPr>
+      </w:pPr>
+    </w:p>
+    <w:p>
+      <w:pPr>
+        <w:pStyle w:val="ListParagraph"/>
+        <w:rPr>
+          <w:sz w:val="28"/>
+          <w:szCs w:val="28"/>
+        </w:rPr>
+      </w:pPr>
+    </w:p>
+    <w:p>
+      <w:pPr>
+        <w:pStyle w:val="ListParagraph"/>
+        <w:rPr>
+          <w:sz w:val="28"/>
+          <w:szCs w:val="28"/>
+        </w:rPr>
+      </w:pPr>
+    </w:p>
+    <w:p>
+      <w:pPr>
+        <w:pStyle w:val="ListParagraph"/>
+        <w:rPr>
+          <w:sz w:val="28"/>
+          <w:szCs w:val="28"/>
+        </w:rPr>
+      </w:pPr>
+    </w:p>
+    <w:p>
+      <w:pPr>
+        <w:pStyle w:val="ListParagraph"/>
+        <w:rPr>
+          <w:sz w:val="28"/>
+          <w:szCs w:val="28"/>
+        </w:rPr>
+      </w:pPr>
+    </w:p>
+    <w:p>
+      <w:pPr>
+        <w:pStyle w:val="ListParagraph"/>
+        <w:rPr>
+          <w:sz w:val="28"/>
+          <w:szCs w:val="28"/>
+        </w:rPr>
+      </w:pPr>
+    </w:p>
+    <w:p>
+      <w:pPr>
+        <w:pStyle w:val="ListParagraph"/>
+        <w:rPr>
+          <w:sz w:val="28"/>
+          <w:szCs w:val="28"/>
+        </w:rPr>
+      </w:pPr>
+    </w:p>
+    <w:p>
+      <w:pPr>
+        <w:pStyle w:val="ListParagraph"/>
+        <w:rPr>
+          <w:sz w:val="28"/>
+          <w:szCs w:val="28"/>
+        </w:rPr>
+      </w:pPr>
+    </w:p>
+    <w:p>
+      <w:pPr>
+        <w:pStyle w:val="ListParagraph"/>
+        <w:rPr>
+          <w:sz w:val="28"/>
+          <w:szCs w:val="28"/>
+        </w:rPr>
+      </w:pPr>
+    </w:p>
+    <w:p>
+      <w:pPr>
+        <w:pStyle w:val="ListParagraph"/>
+        <w:rPr>
+          <w:sz w:val="28"/>
+          <w:szCs w:val="28"/>
+        </w:rPr>
+      </w:pPr>
+    </w:p>
+    <w:p>
+      <w:pPr>
+        <w:rPr>
+          <w:b/>
+          <w:bCs/>
+          <w:sz w:val="32"/>
+          <w:szCs w:val="32"/>
+        </w:rPr>
+      </w:pPr>
+    </w:p>
+    <w:p>
+      <w:pPr>
+        <w:rPr>
+          <w:sz w:val="28"/>
+          <w:szCs w:val="28"/>
+        </w:rPr>
+      </w:pPr>
+    </w:p>
+    <w:p>
+      <w:pPr>
+        <w:rPr>
+          <w:sz w:val="28"/>
+          <w:szCs w:val="28"/>
+        </w:rPr>
+      </w:pPr>
+    </w:p>
+    <w:p>
+      <w:pPr>
+        <w:rPr>
+          <w:sz w:val="28"/>
+          <w:szCs w:val="28"/>
+        </w:rPr>
+      </w:pPr>
+    </w:p>
+    <w:p>
+      <w:pPr>
+        <w:rPr>
+          <w:sz w:val="28"/>
+          <w:szCs w:val="28"/>
+        </w:rPr>
+      </w:pPr>
+    </w:p>
+    <w:p>
+      <w:pPr>
+        <w:rPr>
+          <w:sz w:val="28"/>
+          <w:szCs w:val="28"/>
+        </w:rPr>
+      </w:pPr>
+    </w:p>
+    <w:p>
+      <w:pPr>
+        <w:rPr>
+          <w:b/>
+          <w:bCs/>
+          <w:sz w:val="32"/>
+          <w:szCs w:val="32"/>
+        </w:rPr>
+      </w:pPr>
+      <w:r>
+        <w:rPr>
+          <w:b/>
+          <w:bCs/>
+          <w:sz w:val="32"/>
+          <w:szCs w:val="32"/>
+        </w:rPr>
+        <w:t xml:space="preserve">OUTPUT: </w:t>
+      </w:r>
+    </w:p>
+    <w:p>
+      <w:pPr>
+        <w:rPr>
+          <w:sz w:val="28"/>
+          <w:szCs w:val="28"/>
+        </w:rPr>
+      </w:pPr>
+    </w:p>
+    <w:p>
+      <w:pPr>
+        <w:rPr>
+          <w:sz w:val="28"/>
+          <w:szCs w:val="28"/>
+        </w:rPr>
+      </w:pPr>
+      <w:r>
+        <w:rPr>
+          <w:sz w:val="28"/>
+          <w:szCs w:val="28"/>
+        </w:rPr>
+        <w:drawing>
+          <wp:anchor distT="0" distB="0" distL="114300" distR="114300" simplePos="0" relativeHeight="251672576" behindDoc="0" locked="0" layoutInCell="1" allowOverlap="1" wp14:anchorId="46DEA9CE" wp14:editId="28F8294A">
+            <wp:simplePos x="0" y="0"/>
+            <wp:positionH relativeFrom="column">
+              <wp:posOffset>-370114</wp:posOffset>
+            </wp:positionH>
+            <wp:positionV relativeFrom="paragraph">
+              <wp:posOffset>307703</wp:posOffset>
+            </wp:positionV>
+            <wp:extent cx="6160770" cy="2579914"/>
+            <wp:effectExtent l="0" t="0" r="0" b="0"/>
+            <wp:wrapNone/>
+            <wp:docPr id="1013843404" name="Picture 1"/>
+            <wp:cNvGraphicFramePr>
+              <a:graphicFrameLocks xmlns:a="http://schemas.openxmlformats.org/drawingml/2006/main" noChangeAspect="1"/>
+            </wp:cNvGraphicFramePr>
+            <a:graphic xmlns:a="http://schemas.openxmlformats.org/drawingml/2006/main">
+              <a:graphicData uri="http://schemas.openxmlformats.org/drawingml/2006/picture">
+                <pic:pic xmlns:pic="http://schemas.openxmlformats.org/drawingml/2006/picture">
+                  <pic:nvPicPr>
+                    <pic:cNvPr id="1013843404" name=""/>
+                    <pic:cNvPicPr/>
+                  </pic:nvPicPr>
+                  <pic:blipFill>
+                    <a:blip r:embed="rId9">
+                      <a:extLst>
+                        <a:ext uri="{28A0092B-C50C-407E-A947-70E740481C1C}">
+                          <a14:useLocalDpi xmlns:a14="http://schemas.microsoft.com/office/drawing/2010/main" val="0"/>
+                        </a:ext>
+                      </a:extLst>
+                    </a:blip>
+                    <a:stretch>
+                      <a:fillRect/>
+                    </a:stretch>
+                  </pic:blipFill>
+                  <pic:spPr>
+                    <a:xfrm>
+                      <a:off x="0" y="0"/>
+                      <a:ext cx="6166058" cy="2582128"/>
                     </a:xfrm>
                     <a:prstGeom prst="rect">
                       <a:avLst/>
@@ -517,233 +982,165 @@
     <w:p>
       <w:pPr>
         <w:rPr>
-          <w:b/>
-          <w:bCs/>
+          <w:sz w:val="28"/>
+          <w:szCs w:val="28"/>
+        </w:rPr>
+      </w:pPr>
+    </w:p>
+    <w:p>
+      <w:pPr>
+        <w:rPr>
+          <w:sz w:val="28"/>
+          <w:szCs w:val="28"/>
+        </w:rPr>
+      </w:pPr>
+    </w:p>
+    <w:p>
+      <w:pPr>
+        <w:rPr>
+          <w:sz w:val="28"/>
+          <w:szCs w:val="28"/>
+        </w:rPr>
+      </w:pPr>
+    </w:p>
+    <w:p>
+      <w:pPr>
+        <w:rPr>
+          <w:sz w:val="28"/>
+          <w:szCs w:val="28"/>
+        </w:rPr>
+      </w:pPr>
+    </w:p>
+    <w:p>
+      <w:pPr>
+        <w:rPr>
+          <w:sz w:val="28"/>
+          <w:szCs w:val="28"/>
+        </w:rPr>
+      </w:pPr>
+    </w:p>
+    <w:p>
+      <w:pPr>
+        <w:rPr>
+          <w:sz w:val="28"/>
+          <w:szCs w:val="28"/>
+        </w:rPr>
+      </w:pPr>
+    </w:p>
+    <w:p>
+      <w:pPr>
+        <w:rPr>
+          <w:sz w:val="28"/>
+          <w:szCs w:val="28"/>
+        </w:rPr>
+      </w:pPr>
+    </w:p>
+    <w:p>
+      <w:pPr>
+        <w:rPr>
+          <w:sz w:val="28"/>
+          <w:szCs w:val="28"/>
+        </w:rPr>
+      </w:pPr>
+    </w:p>
+    <w:p>
+      <w:pPr>
+        <w:rPr>
+          <w:sz w:val="28"/>
+          <w:szCs w:val="28"/>
+        </w:rPr>
+      </w:pPr>
+    </w:p>
+    <w:p>
+      <w:pPr>
+        <w:rPr>
+          <w:sz w:val="28"/>
+          <w:szCs w:val="28"/>
+        </w:rPr>
+      </w:pPr>
+    </w:p>
+    <w:p>
+      <w:pPr>
+        <w:rPr>
+          <w:sz w:val="28"/>
+          <w:szCs w:val="28"/>
+        </w:rPr>
+      </w:pPr>
+    </w:p>
+    <w:p>
+      <w:pPr>
+        <w:rPr>
+          <w:sz w:val="28"/>
+          <w:szCs w:val="28"/>
+        </w:rPr>
+      </w:pPr>
+    </w:p>
+    <w:p>
+      <w:pPr>
+        <w:rPr>
+          <w:sz w:val="28"/>
+          <w:szCs w:val="28"/>
+        </w:rPr>
+      </w:pPr>
+    </w:p>
+    <w:p>
+      <w:pPr>
+        <w:rPr>
+          <w:sz w:val="28"/>
+          <w:szCs w:val="28"/>
+        </w:rPr>
+      </w:pPr>
+    </w:p>
+    <w:p>
+      <w:pPr>
+        <w:rPr>
+          <w:sz w:val="28"/>
+          <w:szCs w:val="28"/>
+        </w:rPr>
+      </w:pPr>
+    </w:p>
+    <w:p>
+      <w:pPr>
+        <w:rPr>
+          <w:sz w:val="28"/>
+          <w:szCs w:val="28"/>
+        </w:rPr>
+      </w:pPr>
+    </w:p>
+    <w:p>
+      <w:pPr>
+        <w:rPr>
           <w:sz w:val="32"/>
           <w:szCs w:val="32"/>
         </w:rPr>
       </w:pPr>
-    </w:p>
-    <w:p>
-      <w:pPr>
+      <w:r>
         <w:rPr>
           <w:b/>
           <w:bCs/>
           <w:sz w:val="32"/>
           <w:szCs w:val="32"/>
         </w:rPr>
-      </w:pPr>
-    </w:p>
-    <w:p>
-      <w:pPr>
+        <w:lastRenderedPageBreak/>
+        <w:t xml:space="preserve">Lab </w:t>
+      </w:r>
+      <w:r>
         <w:rPr>
           <w:b/>
           <w:bCs/>
           <w:sz w:val="32"/>
           <w:szCs w:val="32"/>
         </w:rPr>
-      </w:pPr>
+        <w:t>4</w:t>
+      </w:r>
     </w:p>
     <w:p>
       <w:pPr>
         <w:pStyle w:val="ListParagraph"/>
-        <w:rPr>
-          <w:sz w:val="28"/>
-          <w:szCs w:val="28"/>
-        </w:rPr>
-      </w:pPr>
-    </w:p>
-    <w:p>
-      <w:pPr>
-        <w:pStyle w:val="ListParagraph"/>
-        <w:rPr>
-          <w:sz w:val="28"/>
-          <w:szCs w:val="28"/>
-        </w:rPr>
-      </w:pPr>
-    </w:p>
-    <w:p>
-      <w:pPr>
-        <w:pStyle w:val="ListParagraph"/>
-        <w:rPr>
-          <w:sz w:val="28"/>
-          <w:szCs w:val="28"/>
-        </w:rPr>
-      </w:pPr>
-    </w:p>
-    <w:p>
-      <w:pPr>
-        <w:pStyle w:val="ListParagraph"/>
-        <w:rPr>
-          <w:sz w:val="28"/>
-          <w:szCs w:val="28"/>
-        </w:rPr>
-      </w:pPr>
-    </w:p>
-    <w:p>
-      <w:pPr>
-        <w:pStyle w:val="ListParagraph"/>
-        <w:rPr>
-          <w:sz w:val="28"/>
-          <w:szCs w:val="28"/>
-        </w:rPr>
-      </w:pPr>
-    </w:p>
-    <w:p>
-      <w:pPr>
-        <w:pStyle w:val="ListParagraph"/>
-        <w:rPr>
-          <w:sz w:val="28"/>
-          <w:szCs w:val="28"/>
-        </w:rPr>
-      </w:pPr>
-    </w:p>
-    <w:p>
-      <w:pPr>
-        <w:pStyle w:val="ListParagraph"/>
-        <w:rPr>
-          <w:sz w:val="28"/>
-          <w:szCs w:val="28"/>
-        </w:rPr>
-      </w:pPr>
-    </w:p>
-    <w:p>
-      <w:pPr>
-        <w:pStyle w:val="ListParagraph"/>
-        <w:rPr>
-          <w:sz w:val="28"/>
-          <w:szCs w:val="28"/>
-        </w:rPr>
-      </w:pPr>
-    </w:p>
-    <w:p>
-      <w:pPr>
-        <w:pStyle w:val="ListParagraph"/>
-        <w:rPr>
-          <w:sz w:val="28"/>
-          <w:szCs w:val="28"/>
-        </w:rPr>
-      </w:pPr>
-    </w:p>
-    <w:p>
-      <w:pPr>
-        <w:pStyle w:val="ListParagraph"/>
-        <w:rPr>
-          <w:sz w:val="28"/>
-          <w:szCs w:val="28"/>
-        </w:rPr>
-      </w:pPr>
-    </w:p>
-    <w:p>
-      <w:pPr>
-        <w:pStyle w:val="ListParagraph"/>
-        <w:rPr>
-          <w:sz w:val="28"/>
-          <w:szCs w:val="28"/>
-        </w:rPr>
-      </w:pPr>
-    </w:p>
-    <w:p>
-      <w:pPr>
-        <w:pStyle w:val="ListParagraph"/>
-        <w:rPr>
-          <w:sz w:val="28"/>
-          <w:szCs w:val="28"/>
-        </w:rPr>
-      </w:pPr>
-    </w:p>
-    <w:p>
-      <w:pPr>
-        <w:pStyle w:val="ListParagraph"/>
-        <w:rPr>
-          <w:sz w:val="28"/>
-          <w:szCs w:val="28"/>
-        </w:rPr>
-      </w:pPr>
-    </w:p>
-    <w:p>
-      <w:pPr>
-        <w:pStyle w:val="ListParagraph"/>
-        <w:rPr>
-          <w:sz w:val="28"/>
-          <w:szCs w:val="28"/>
-        </w:rPr>
-      </w:pPr>
-    </w:p>
-    <w:p>
-      <w:pPr>
-        <w:pStyle w:val="ListParagraph"/>
-        <w:rPr>
-          <w:sz w:val="28"/>
-          <w:szCs w:val="28"/>
-        </w:rPr>
-      </w:pPr>
-    </w:p>
-    <w:p>
-      <w:pPr>
-        <w:pStyle w:val="ListParagraph"/>
-        <w:rPr>
-          <w:sz w:val="28"/>
-          <w:szCs w:val="28"/>
-        </w:rPr>
-      </w:pPr>
-    </w:p>
-    <w:p>
-      <w:pPr>
-        <w:pStyle w:val="ListParagraph"/>
-        <w:rPr>
-          <w:sz w:val="28"/>
-          <w:szCs w:val="28"/>
-        </w:rPr>
-      </w:pPr>
-    </w:p>
-    <w:p>
-      <w:pPr>
-        <w:pStyle w:val="ListParagraph"/>
-        <w:rPr>
-          <w:sz w:val="28"/>
-          <w:szCs w:val="28"/>
-        </w:rPr>
-      </w:pPr>
-    </w:p>
-    <w:p>
-      <w:pPr>
-        <w:pStyle w:val="ListParagraph"/>
-        <w:rPr>
-          <w:sz w:val="28"/>
-          <w:szCs w:val="28"/>
-        </w:rPr>
-      </w:pPr>
-    </w:p>
-    <w:p>
-      <w:pPr>
-        <w:pStyle w:val="ListParagraph"/>
-        <w:rPr>
-          <w:sz w:val="28"/>
-          <w:szCs w:val="28"/>
-        </w:rPr>
-      </w:pPr>
-    </w:p>
-    <w:p>
-      <w:pPr>
-        <w:pStyle w:val="ListParagraph"/>
-        <w:rPr>
-          <w:sz w:val="28"/>
-          <w:szCs w:val="28"/>
-        </w:rPr>
-      </w:pPr>
-    </w:p>
-    <w:p>
-      <w:pPr>
-        <w:pStyle w:val="ListParagraph"/>
-        <w:rPr>
-          <w:sz w:val="28"/>
-          <w:szCs w:val="28"/>
-        </w:rPr>
-      </w:pPr>
-    </w:p>
-    <w:p>
-      <w:pPr>
+        <w:numPr>
+          <w:ilvl w:val="0"/>
+          <w:numId w:val="25"/>
+        </w:numPr>
         <w:rPr>
           <w:sz w:val="28"/>
           <w:szCs w:val="28"/>
@@ -751,22 +1148,72 @@
       </w:pPr>
       <w:r>
         <w:rPr>
+          <w:b/>
+          <w:bCs/>
+          <w:sz w:val="28"/>
+          <w:szCs w:val="28"/>
+        </w:rPr>
+        <w:t>Find a Path Between Two Nodes</w:t>
+      </w:r>
+      <w:r>
+        <w:rPr>
+          <w:b/>
+          <w:bCs/>
+          <w:sz w:val="28"/>
+          <w:szCs w:val="28"/>
+        </w:rPr>
+        <w:br/>
+      </w:r>
+      <w:r>
+        <w:rPr>
+          <w:b/>
+          <w:bCs/>
+          <w:sz w:val="28"/>
+          <w:szCs w:val="28"/>
+        </w:rPr>
+        <w:br/>
+      </w:r>
+      <w:r>
+        <w:rPr>
+          <w:sz w:val="28"/>
+          <w:szCs w:val="28"/>
+        </w:rPr>
+        <w:t xml:space="preserve">Using DFS on the given graph, find if a path exists from Node 0 to Node 6. Print the complete path if found (e.g. 0 → 2 → 5 → 6), or print </w:t>
+      </w:r>
+      <w:r>
+        <w:rPr>
+          <w:sz w:val="28"/>
+          <w:szCs w:val="28"/>
+        </w:rPr>
+        <w:br/>
+        <w:t>'No path found'. Stop as soon as the destination is reached</w:t>
+      </w:r>
+    </w:p>
+    <w:p>
+      <w:pPr>
+        <w:rPr>
+          <w:sz w:val="28"/>
+          <w:szCs w:val="28"/>
+        </w:rPr>
+      </w:pPr>
+      <w:r>
+        <w:rPr>
           <w:sz w:val="28"/>
           <w:szCs w:val="28"/>
         </w:rPr>
         <w:drawing>
-          <wp:anchor distT="0" distB="0" distL="114300" distR="114300" simplePos="0" relativeHeight="251660288" behindDoc="0" locked="0" layoutInCell="1" allowOverlap="1" wp14:anchorId="073531F6" wp14:editId="73E160E5">
+          <wp:anchor distT="0" distB="0" distL="114300" distR="114300" simplePos="0" relativeHeight="251673600" behindDoc="0" locked="0" layoutInCell="1" allowOverlap="1" wp14:anchorId="289BEC23" wp14:editId="00BF2B94">
             <wp:simplePos x="0" y="0"/>
             <wp:positionH relativeFrom="column">
-              <wp:posOffset>-32658</wp:posOffset>
+              <wp:posOffset>348343</wp:posOffset>
             </wp:positionH>
             <wp:positionV relativeFrom="paragraph">
-              <wp:posOffset>197757</wp:posOffset>
+              <wp:posOffset>5080</wp:posOffset>
             </wp:positionV>
-            <wp:extent cx="5745480" cy="5093426"/>
-            <wp:effectExtent l="0" t="0" r="7620" b="0"/>
+            <wp:extent cx="5303520" cy="7271657"/>
+            <wp:effectExtent l="0" t="0" r="0" b="5715"/>
             <wp:wrapNone/>
-            <wp:docPr id="1487433637" name="Picture 1"/>
+            <wp:docPr id="738275385" name="Picture 1"/>
             <wp:cNvGraphicFramePr>
               <a:graphicFrameLocks xmlns:a="http://schemas.openxmlformats.org/drawingml/2006/main" noChangeAspect="1"/>
             </wp:cNvGraphicFramePr>
@@ -774,291 +1221,7 @@
               <a:graphicData uri="http://schemas.openxmlformats.org/drawingml/2006/picture">
                 <pic:pic xmlns:pic="http://schemas.openxmlformats.org/drawingml/2006/picture">
                   <pic:nvPicPr>
-                    <pic:cNvPr id="1487433637" name=""/>
-                    <pic:cNvPicPr/>
-                  </pic:nvPicPr>
-                  <pic:blipFill>
-                    <a:blip r:embed="rId9">
-                      <a:extLst>
-                        <a:ext uri="{28A0092B-C50C-407E-A947-70E740481C1C}">
-                          <a14:useLocalDpi xmlns:a14="http://schemas.microsoft.com/office/drawing/2010/main" val="0"/>
-                        </a:ext>
-                      </a:extLst>
-                    </a:blip>
-                    <a:stretch>
-                      <a:fillRect/>
-                    </a:stretch>
-                  </pic:blipFill>
-                  <pic:spPr>
-                    <a:xfrm>
-                      <a:off x="0" y="0"/>
-                      <a:ext cx="5745480" cy="5093426"/>
-                    </a:xfrm>
-                    <a:prstGeom prst="rect">
-                      <a:avLst/>
-                    </a:prstGeom>
-                  </pic:spPr>
-                </pic:pic>
-              </a:graphicData>
-            </a:graphic>
-          </wp:anchor>
-        </w:drawing>
-      </w:r>
-    </w:p>
-    <w:p>
-      <w:pPr>
-        <w:pStyle w:val="ListParagraph"/>
-        <w:rPr>
-          <w:sz w:val="28"/>
-          <w:szCs w:val="28"/>
-        </w:rPr>
-      </w:pPr>
-    </w:p>
-    <w:p>
-      <w:pPr>
-        <w:pStyle w:val="ListParagraph"/>
-        <w:rPr>
-          <w:sz w:val="28"/>
-          <w:szCs w:val="28"/>
-        </w:rPr>
-      </w:pPr>
-    </w:p>
-    <w:p>
-      <w:pPr>
-        <w:pStyle w:val="ListParagraph"/>
-        <w:rPr>
-          <w:sz w:val="28"/>
-          <w:szCs w:val="28"/>
-        </w:rPr>
-      </w:pPr>
-    </w:p>
-    <w:p>
-      <w:pPr>
-        <w:pStyle w:val="ListParagraph"/>
-        <w:rPr>
-          <w:sz w:val="28"/>
-          <w:szCs w:val="28"/>
-        </w:rPr>
-      </w:pPr>
-    </w:p>
-    <w:p>
-      <w:pPr>
-        <w:pStyle w:val="ListParagraph"/>
-        <w:rPr>
-          <w:sz w:val="28"/>
-          <w:szCs w:val="28"/>
-        </w:rPr>
-      </w:pPr>
-    </w:p>
-    <w:p>
-      <w:pPr>
-        <w:pStyle w:val="ListParagraph"/>
-        <w:rPr>
-          <w:sz w:val="28"/>
-          <w:szCs w:val="28"/>
-        </w:rPr>
-      </w:pPr>
-    </w:p>
-    <w:p>
-      <w:pPr>
-        <w:pStyle w:val="ListParagraph"/>
-        <w:rPr>
-          <w:sz w:val="28"/>
-          <w:szCs w:val="28"/>
-        </w:rPr>
-      </w:pPr>
-    </w:p>
-    <w:p>
-      <w:pPr>
-        <w:pStyle w:val="ListParagraph"/>
-        <w:rPr>
-          <w:sz w:val="28"/>
-          <w:szCs w:val="28"/>
-        </w:rPr>
-      </w:pPr>
-    </w:p>
-    <w:p>
-      <w:pPr>
-        <w:pStyle w:val="ListParagraph"/>
-        <w:rPr>
-          <w:sz w:val="28"/>
-          <w:szCs w:val="28"/>
-        </w:rPr>
-      </w:pPr>
-    </w:p>
-    <w:p>
-      <w:pPr>
-        <w:pStyle w:val="ListParagraph"/>
-        <w:rPr>
-          <w:sz w:val="28"/>
-          <w:szCs w:val="28"/>
-        </w:rPr>
-      </w:pPr>
-    </w:p>
-    <w:p>
-      <w:pPr>
-        <w:rPr>
-          <w:sz w:val="28"/>
-          <w:szCs w:val="28"/>
-        </w:rPr>
-      </w:pPr>
-    </w:p>
-    <w:p>
-      <w:pPr>
-        <w:rPr>
-          <w:sz w:val="28"/>
-          <w:szCs w:val="28"/>
-        </w:rPr>
-      </w:pPr>
-    </w:p>
-    <w:p>
-      <w:pPr>
-        <w:rPr>
-          <w:sz w:val="28"/>
-          <w:szCs w:val="28"/>
-        </w:rPr>
-      </w:pPr>
-    </w:p>
-    <w:p>
-      <w:pPr>
-        <w:rPr>
-          <w:sz w:val="28"/>
-          <w:szCs w:val="28"/>
-        </w:rPr>
-      </w:pPr>
-    </w:p>
-    <w:p>
-      <w:pPr>
-        <w:rPr>
-          <w:sz w:val="28"/>
-          <w:szCs w:val="28"/>
-        </w:rPr>
-      </w:pPr>
-    </w:p>
-    <w:p>
-      <w:pPr>
-        <w:rPr>
-          <w:sz w:val="28"/>
-          <w:szCs w:val="28"/>
-        </w:rPr>
-      </w:pPr>
-    </w:p>
-    <w:p>
-      <w:pPr>
-        <w:rPr>
-          <w:sz w:val="28"/>
-          <w:szCs w:val="28"/>
-        </w:rPr>
-      </w:pPr>
-    </w:p>
-    <w:p>
-      <w:pPr>
-        <w:rPr>
-          <w:sz w:val="28"/>
-          <w:szCs w:val="28"/>
-        </w:rPr>
-      </w:pPr>
-    </w:p>
-    <w:p>
-      <w:pPr>
-        <w:rPr>
-          <w:sz w:val="28"/>
-          <w:szCs w:val="28"/>
-        </w:rPr>
-      </w:pPr>
-    </w:p>
-    <w:p>
-      <w:pPr>
-        <w:rPr>
-          <w:sz w:val="28"/>
-          <w:szCs w:val="28"/>
-        </w:rPr>
-      </w:pPr>
-    </w:p>
-    <w:p>
-      <w:pPr>
-        <w:rPr>
-          <w:sz w:val="28"/>
-          <w:szCs w:val="28"/>
-        </w:rPr>
-      </w:pPr>
-    </w:p>
-    <w:p>
-      <w:pPr>
-        <w:rPr>
-          <w:sz w:val="28"/>
-          <w:szCs w:val="28"/>
-        </w:rPr>
-      </w:pPr>
-    </w:p>
-    <w:p>
-      <w:pPr>
-        <w:rPr>
-          <w:sz w:val="28"/>
-          <w:szCs w:val="28"/>
-        </w:rPr>
-      </w:pPr>
-    </w:p>
-    <w:p>
-      <w:pPr>
-        <w:rPr>
-          <w:sz w:val="28"/>
-          <w:szCs w:val="28"/>
-        </w:rPr>
-      </w:pPr>
-    </w:p>
-    <w:p>
-      <w:pPr>
-        <w:rPr>
-          <w:b/>
-          <w:bCs/>
-          <w:sz w:val="32"/>
-          <w:szCs w:val="32"/>
-        </w:rPr>
-      </w:pPr>
-      <w:r>
-        <w:rPr>
-          <w:b/>
-          <w:bCs/>
-          <w:sz w:val="32"/>
-          <w:szCs w:val="32"/>
-        </w:rPr>
-        <w:t xml:space="preserve">OUTPUT: </w:t>
-      </w:r>
-    </w:p>
-    <w:p>
-      <w:pPr>
-        <w:rPr>
-          <w:sz w:val="28"/>
-          <w:szCs w:val="28"/>
-        </w:rPr>
-      </w:pPr>
-      <w:r>
-        <w:rPr>
-          <w:sz w:val="28"/>
-          <w:szCs w:val="28"/>
-        </w:rPr>
-        <w:drawing>
-          <wp:anchor distT="0" distB="0" distL="114300" distR="114300" simplePos="0" relativeHeight="251661312" behindDoc="0" locked="0" layoutInCell="1" allowOverlap="1" wp14:anchorId="1F865AB0" wp14:editId="1F68B243">
-            <wp:simplePos x="0" y="0"/>
-            <wp:positionH relativeFrom="margin">
-              <wp:posOffset>-576943</wp:posOffset>
-            </wp:positionH>
-            <wp:positionV relativeFrom="paragraph">
-              <wp:posOffset>348343</wp:posOffset>
-            </wp:positionV>
-            <wp:extent cx="6934200" cy="3417570"/>
-            <wp:effectExtent l="0" t="0" r="0" b="0"/>
-            <wp:wrapNone/>
-            <wp:docPr id="1447731478" name="Picture 1"/>
-            <wp:cNvGraphicFramePr>
-              <a:graphicFrameLocks xmlns:a="http://schemas.openxmlformats.org/drawingml/2006/main" noChangeAspect="1"/>
-            </wp:cNvGraphicFramePr>
-            <a:graphic xmlns:a="http://schemas.openxmlformats.org/drawingml/2006/main">
-              <a:graphicData uri="http://schemas.openxmlformats.org/drawingml/2006/picture">
-                <pic:pic xmlns:pic="http://schemas.openxmlformats.org/drawingml/2006/picture">
-                  <pic:nvPicPr>
-                    <pic:cNvPr id="1447731478" name=""/>
+                    <pic:cNvPr id="738275385" name=""/>
                     <pic:cNvPicPr/>
                   </pic:nvPicPr>
                   <pic:blipFill>
@@ -1076,7 +1239,276 @@
                   <pic:spPr>
                     <a:xfrm>
                       <a:off x="0" y="0"/>
-                      <a:ext cx="6945631" cy="3423204"/>
+                      <a:ext cx="5304637" cy="7273188"/>
+                    </a:xfrm>
+                    <a:prstGeom prst="rect">
+                      <a:avLst/>
+                    </a:prstGeom>
+                  </pic:spPr>
+                </pic:pic>
+              </a:graphicData>
+            </a:graphic>
+            <wp14:sizeRelV relativeFrom="margin">
+              <wp14:pctHeight>0</wp14:pctHeight>
+            </wp14:sizeRelV>
+          </wp:anchor>
+        </w:drawing>
+      </w:r>
+    </w:p>
+    <w:p>
+      <w:pPr>
+        <w:rPr>
+          <w:sz w:val="28"/>
+          <w:szCs w:val="28"/>
+        </w:rPr>
+      </w:pPr>
+    </w:p>
+    <w:p>
+      <w:pPr>
+        <w:rPr>
+          <w:sz w:val="28"/>
+          <w:szCs w:val="28"/>
+        </w:rPr>
+      </w:pPr>
+    </w:p>
+    <w:p>
+      <w:pPr>
+        <w:rPr>
+          <w:sz w:val="28"/>
+          <w:szCs w:val="28"/>
+        </w:rPr>
+      </w:pPr>
+    </w:p>
+    <w:p>
+      <w:pPr>
+        <w:rPr>
+          <w:sz w:val="28"/>
+          <w:szCs w:val="28"/>
+        </w:rPr>
+      </w:pPr>
+    </w:p>
+    <w:p>
+      <w:pPr>
+        <w:rPr>
+          <w:sz w:val="28"/>
+          <w:szCs w:val="28"/>
+        </w:rPr>
+      </w:pPr>
+    </w:p>
+    <w:p>
+      <w:pPr>
+        <w:rPr>
+          <w:sz w:val="28"/>
+          <w:szCs w:val="28"/>
+        </w:rPr>
+      </w:pPr>
+    </w:p>
+    <w:p>
+      <w:pPr>
+        <w:rPr>
+          <w:sz w:val="28"/>
+          <w:szCs w:val="28"/>
+        </w:rPr>
+      </w:pPr>
+    </w:p>
+    <w:p>
+      <w:pPr>
+        <w:rPr>
+          <w:sz w:val="28"/>
+          <w:szCs w:val="28"/>
+        </w:rPr>
+      </w:pPr>
+    </w:p>
+    <w:p>
+      <w:pPr>
+        <w:rPr>
+          <w:sz w:val="28"/>
+          <w:szCs w:val="28"/>
+        </w:rPr>
+      </w:pPr>
+    </w:p>
+    <w:p>
+      <w:pPr>
+        <w:rPr>
+          <w:sz w:val="28"/>
+          <w:szCs w:val="28"/>
+        </w:rPr>
+      </w:pPr>
+    </w:p>
+    <w:p>
+      <w:pPr>
+        <w:rPr>
+          <w:sz w:val="28"/>
+          <w:szCs w:val="28"/>
+        </w:rPr>
+      </w:pPr>
+    </w:p>
+    <w:p>
+      <w:pPr>
+        <w:rPr>
+          <w:sz w:val="28"/>
+          <w:szCs w:val="28"/>
+        </w:rPr>
+      </w:pPr>
+    </w:p>
+    <w:p>
+      <w:pPr>
+        <w:rPr>
+          <w:sz w:val="28"/>
+          <w:szCs w:val="28"/>
+        </w:rPr>
+      </w:pPr>
+    </w:p>
+    <w:p>
+      <w:pPr>
+        <w:rPr>
+          <w:sz w:val="28"/>
+          <w:szCs w:val="28"/>
+        </w:rPr>
+      </w:pPr>
+    </w:p>
+    <w:p>
+      <w:pPr>
+        <w:rPr>
+          <w:sz w:val="28"/>
+          <w:szCs w:val="28"/>
+        </w:rPr>
+      </w:pPr>
+    </w:p>
+    <w:p>
+      <w:pPr>
+        <w:rPr>
+          <w:sz w:val="28"/>
+          <w:szCs w:val="28"/>
+        </w:rPr>
+      </w:pPr>
+    </w:p>
+    <w:p>
+      <w:pPr>
+        <w:rPr>
+          <w:sz w:val="28"/>
+          <w:szCs w:val="28"/>
+        </w:rPr>
+      </w:pPr>
+    </w:p>
+    <w:p>
+      <w:pPr>
+        <w:rPr>
+          <w:sz w:val="28"/>
+          <w:szCs w:val="28"/>
+        </w:rPr>
+      </w:pPr>
+    </w:p>
+    <w:p>
+      <w:pPr>
+        <w:rPr>
+          <w:sz w:val="28"/>
+          <w:szCs w:val="28"/>
+        </w:rPr>
+      </w:pPr>
+    </w:p>
+    <w:p>
+      <w:pPr>
+        <w:rPr>
+          <w:sz w:val="28"/>
+          <w:szCs w:val="28"/>
+        </w:rPr>
+      </w:pPr>
+    </w:p>
+    <w:p>
+      <w:pPr>
+        <w:rPr>
+          <w:sz w:val="28"/>
+          <w:szCs w:val="28"/>
+        </w:rPr>
+      </w:pPr>
+    </w:p>
+    <w:p>
+      <w:pPr>
+        <w:rPr>
+          <w:sz w:val="28"/>
+          <w:szCs w:val="28"/>
+        </w:rPr>
+      </w:pPr>
+    </w:p>
+    <w:p>
+      <w:pPr>
+        <w:rPr>
+          <w:sz w:val="28"/>
+          <w:szCs w:val="28"/>
+        </w:rPr>
+      </w:pPr>
+    </w:p>
+    <w:p>
+      <w:pPr>
+        <w:rPr>
+          <w:b/>
+          <w:bCs/>
+          <w:sz w:val="32"/>
+          <w:szCs w:val="32"/>
+        </w:rPr>
+      </w:pPr>
+      <w:r>
+        <w:rPr>
+          <w:b/>
+          <w:bCs/>
+          <w:sz w:val="32"/>
+          <w:szCs w:val="32"/>
+        </w:rPr>
+        <w:t xml:space="preserve">OUTPUT: </w:t>
+      </w:r>
+    </w:p>
+    <w:p>
+      <w:pPr>
+        <w:rPr>
+          <w:sz w:val="28"/>
+          <w:szCs w:val="28"/>
+        </w:rPr>
+      </w:pPr>
+      <w:r>
+        <w:rPr>
+          <w:sz w:val="28"/>
+          <w:szCs w:val="28"/>
+        </w:rPr>
+        <w:drawing>
+          <wp:anchor distT="0" distB="0" distL="114300" distR="114300" simplePos="0" relativeHeight="251674624" behindDoc="0" locked="0" layoutInCell="1" allowOverlap="1" wp14:anchorId="29D45F72" wp14:editId="1C1CC4C8">
+            <wp:simplePos x="0" y="0"/>
+            <wp:positionH relativeFrom="margin">
+              <wp:align>right</wp:align>
+            </wp:positionH>
+            <wp:positionV relativeFrom="paragraph">
+              <wp:posOffset>83821</wp:posOffset>
+            </wp:positionV>
+            <wp:extent cx="6182995" cy="2783622"/>
+            <wp:effectExtent l="0" t="0" r="8255" b="0"/>
+            <wp:wrapNone/>
+            <wp:docPr id="576920033" name="Picture 1"/>
+            <wp:cNvGraphicFramePr>
+              <a:graphicFrameLocks xmlns:a="http://schemas.openxmlformats.org/drawingml/2006/main" noChangeAspect="1"/>
+            </wp:cNvGraphicFramePr>
+            <a:graphic xmlns:a="http://schemas.openxmlformats.org/drawingml/2006/main">
+              <a:graphicData uri="http://schemas.openxmlformats.org/drawingml/2006/picture">
+                <pic:pic xmlns:pic="http://schemas.openxmlformats.org/drawingml/2006/picture">
+                  <pic:nvPicPr>
+                    <pic:cNvPr id="576920033" name=""/>
+                    <pic:cNvPicPr/>
+                  </pic:nvPicPr>
+                  <pic:blipFill>
+                    <a:blip r:embed="rId11">
+                      <a:extLst>
+                        <a:ext uri="{28A0092B-C50C-407E-A947-70E740481C1C}">
+                          <a14:useLocalDpi xmlns:a14="http://schemas.microsoft.com/office/drawing/2010/main" val="0"/>
+                        </a:ext>
+                      </a:extLst>
+                    </a:blip>
+                    <a:stretch>
+                      <a:fillRect/>
+                    </a:stretch>
+                  </pic:blipFill>
+                  <pic:spPr>
+                    <a:xfrm>
+                      <a:off x="0" y="0"/>
+                      <a:ext cx="6182995" cy="2783622"/>
                     </a:xfrm>
                     <a:prstGeom prst="rect">
                       <a:avLst/>
@@ -1126,126 +1558,13 @@
           <w:szCs w:val="28"/>
         </w:rPr>
       </w:pPr>
-    </w:p>
-    <w:p>
-      <w:pPr>
-        <w:rPr>
-          <w:sz w:val="28"/>
-          <w:szCs w:val="28"/>
-        </w:rPr>
-      </w:pPr>
-    </w:p>
-    <w:p>
-      <w:pPr>
-        <w:rPr>
-          <w:sz w:val="28"/>
-          <w:szCs w:val="28"/>
-        </w:rPr>
-      </w:pPr>
-    </w:p>
-    <w:p>
-      <w:pPr>
-        <w:rPr>
-          <w:sz w:val="28"/>
-          <w:szCs w:val="28"/>
-        </w:rPr>
-      </w:pPr>
-    </w:p>
-    <w:p>
-      <w:pPr>
-        <w:rPr>
-          <w:sz w:val="28"/>
-          <w:szCs w:val="28"/>
-        </w:rPr>
-      </w:pPr>
-    </w:p>
-    <w:p>
-      <w:pPr>
-        <w:rPr>
-          <w:sz w:val="28"/>
-          <w:szCs w:val="28"/>
-        </w:rPr>
-      </w:pPr>
-    </w:p>
-    <w:p>
-      <w:pPr>
-        <w:rPr>
-          <w:sz w:val="28"/>
-          <w:szCs w:val="28"/>
-        </w:rPr>
-      </w:pPr>
-    </w:p>
-    <w:p>
-      <w:pPr>
-        <w:rPr>
-          <w:sz w:val="28"/>
-          <w:szCs w:val="28"/>
-        </w:rPr>
-      </w:pPr>
-    </w:p>
-    <w:p>
-      <w:pPr>
-        <w:rPr>
-          <w:sz w:val="28"/>
-          <w:szCs w:val="28"/>
-        </w:rPr>
-      </w:pPr>
-    </w:p>
-    <w:p>
-      <w:pPr>
-        <w:rPr>
-          <w:sz w:val="28"/>
-          <w:szCs w:val="28"/>
-        </w:rPr>
-      </w:pPr>
-    </w:p>
-    <w:p>
-      <w:pPr>
-        <w:rPr>
-          <w:sz w:val="28"/>
-          <w:szCs w:val="28"/>
-        </w:rPr>
-      </w:pPr>
-    </w:p>
-    <w:p>
-      <w:pPr>
-        <w:rPr>
-          <w:sz w:val="28"/>
-          <w:szCs w:val="28"/>
-        </w:rPr>
-      </w:pPr>
-    </w:p>
-    <w:p>
-      <w:pPr>
-        <w:rPr>
-          <w:sz w:val="28"/>
-          <w:szCs w:val="28"/>
-        </w:rPr>
-      </w:pPr>
-    </w:p>
-    <w:p>
-      <w:pPr>
-        <w:rPr>
-          <w:sz w:val="28"/>
-          <w:szCs w:val="28"/>
-        </w:rPr>
-      </w:pPr>
-    </w:p>
-    <w:p>
-      <w:pPr>
-        <w:rPr>
-          <w:sz w:val="28"/>
-          <w:szCs w:val="28"/>
-        </w:rPr>
-      </w:pPr>
-    </w:p>
-    <w:p>
-      <w:pPr>
-        <w:rPr>
-          <w:sz w:val="28"/>
-          <w:szCs w:val="28"/>
-        </w:rPr>
-      </w:pPr>
+      <w:r>
+        <w:rPr>
+          <w:sz w:val="28"/>
+          <w:szCs w:val="28"/>
+        </w:rPr>
+        <w:br w:type="page"/>
+      </w:r>
     </w:p>
     <w:p>
       <w:pPr>
@@ -1261,6 +1580,7 @@
           <w:sz w:val="32"/>
           <w:szCs w:val="32"/>
         </w:rPr>
+        <w:lastRenderedPageBreak/>
         <w:t xml:space="preserve">Lab </w:t>
       </w:r>
       <w:r>
@@ -1270,16 +1590,8 @@
           <w:sz w:val="32"/>
           <w:szCs w:val="32"/>
         </w:rPr>
-        <w:t>3</w:t>
+        <w:t>4</w:t>
       </w:r>
-    </w:p>
-    <w:p>
-      <w:pPr>
-        <w:rPr>
-          <w:sz w:val="28"/>
-          <w:szCs w:val="28"/>
-        </w:rPr>
-      </w:pPr>
     </w:p>
     <w:p>
       <w:pPr>
@@ -1300,7 +1612,7 @@
           <w:sz w:val="28"/>
           <w:szCs w:val="28"/>
         </w:rPr>
-        <w:t>8-Queens: First Valid Solution</w:t>
+        <w:t>Detect a Cycle in the Graph</w:t>
       </w:r>
       <w:r>
         <w:rPr>
@@ -1313,6 +1625,21 @@
       </w:r>
       <w:r>
         <w:rPr>
+          <w:sz w:val="28"/>
+          <w:szCs w:val="28"/>
+        </w:rPr>
+        <w:t xml:space="preserve">Check whether the given graph contains a cycle using DFS. Print 'Cycle detected' or 'No cycle found'. Also test your program on a second </w:t>
+      </w:r>
+      <w:r>
+        <w:rPr>
+          <w:sz w:val="28"/>
+          <w:szCs w:val="28"/>
+        </w:rPr>
+        <w:br/>
+        <w:t>graph (a simple tree) to verify the 'No cycle' case.</w:t>
+      </w:r>
+      <w:r>
+        <w:rPr>
           <w:b/>
           <w:bCs/>
           <w:sz w:val="28"/>
@@ -1320,47 +1647,32 @@
         </w:rPr>
         <w:br/>
       </w:r>
+    </w:p>
+    <w:p>
+      <w:pPr>
+        <w:rPr>
+          <w:sz w:val="28"/>
+          <w:szCs w:val="28"/>
+        </w:rPr>
+      </w:pPr>
       <w:r>
         <w:rPr>
           <w:sz w:val="28"/>
           <w:szCs w:val="28"/>
         </w:rPr>
-        <w:t>Write a Python program to solve the 8-Queens problem to print only the first valid solution found and terminate immediately</w:t>
-      </w:r>
-    </w:p>
-    <w:p>
-      <w:pPr>
-        <w:rPr>
-          <w:sz w:val="28"/>
-          <w:szCs w:val="28"/>
-        </w:rPr>
-      </w:pPr>
-    </w:p>
-    <w:p>
-      <w:pPr>
-        <w:rPr>
-          <w:sz w:val="28"/>
-          <w:szCs w:val="28"/>
-        </w:rPr>
-      </w:pPr>
-      <w:r>
-        <w:rPr>
-          <w:sz w:val="28"/>
-          <w:szCs w:val="28"/>
-        </w:rPr>
         <w:drawing>
-          <wp:anchor distT="0" distB="0" distL="114300" distR="114300" simplePos="0" relativeHeight="251662336" behindDoc="0" locked="0" layoutInCell="1" allowOverlap="1" wp14:anchorId="36095340" wp14:editId="7EB60D29">
+          <wp:anchor distT="0" distB="0" distL="114300" distR="114300" simplePos="0" relativeHeight="251675648" behindDoc="0" locked="0" layoutInCell="1" allowOverlap="1" wp14:anchorId="4EC760F2" wp14:editId="305CD196">
             <wp:simplePos x="0" y="0"/>
             <wp:positionH relativeFrom="margin">
-              <wp:align>right</wp:align>
+              <wp:posOffset>1121229</wp:posOffset>
             </wp:positionH>
             <wp:positionV relativeFrom="paragraph">
-              <wp:posOffset>275136</wp:posOffset>
+              <wp:posOffset>92166</wp:posOffset>
             </wp:positionV>
-            <wp:extent cx="5943600" cy="5382260"/>
-            <wp:effectExtent l="0" t="0" r="0" b="8890"/>
+            <wp:extent cx="3961765" cy="6368143"/>
+            <wp:effectExtent l="0" t="0" r="635" b="0"/>
             <wp:wrapNone/>
-            <wp:docPr id="204006521" name="Picture 1"/>
+            <wp:docPr id="2038586180" name="Picture 1"/>
             <wp:cNvGraphicFramePr>
               <a:graphicFrameLocks xmlns:a="http://schemas.openxmlformats.org/drawingml/2006/main" noChangeAspect="1"/>
             </wp:cNvGraphicFramePr>
@@ -1368,382 +1680,7 @@
               <a:graphicData uri="http://schemas.openxmlformats.org/drawingml/2006/picture">
                 <pic:pic xmlns:pic="http://schemas.openxmlformats.org/drawingml/2006/picture">
                   <pic:nvPicPr>
-                    <pic:cNvPr id="204006521" name=""/>
-                    <pic:cNvPicPr/>
-                  </pic:nvPicPr>
-                  <pic:blipFill>
-                    <a:blip r:embed="rId11">
-                      <a:extLst>
-                        <a:ext uri="{28A0092B-C50C-407E-A947-70E740481C1C}">
-                          <a14:useLocalDpi xmlns:a14="http://schemas.microsoft.com/office/drawing/2010/main" val="0"/>
-                        </a:ext>
-                      </a:extLst>
-                    </a:blip>
-                    <a:stretch>
-                      <a:fillRect/>
-                    </a:stretch>
-                  </pic:blipFill>
-                  <pic:spPr>
-                    <a:xfrm>
-                      <a:off x="0" y="0"/>
-                      <a:ext cx="5943600" cy="5382260"/>
-                    </a:xfrm>
-                    <a:prstGeom prst="rect">
-                      <a:avLst/>
-                    </a:prstGeom>
-                  </pic:spPr>
-                </pic:pic>
-              </a:graphicData>
-            </a:graphic>
-          </wp:anchor>
-        </w:drawing>
-      </w:r>
-    </w:p>
-    <w:p>
-      <w:pPr>
-        <w:rPr>
-          <w:sz w:val="28"/>
-          <w:szCs w:val="28"/>
-        </w:rPr>
-      </w:pPr>
-    </w:p>
-    <w:p>
-      <w:pPr>
-        <w:rPr>
-          <w:sz w:val="28"/>
-          <w:szCs w:val="28"/>
-        </w:rPr>
-      </w:pPr>
-    </w:p>
-    <w:p>
-      <w:pPr>
-        <w:rPr>
-          <w:sz w:val="28"/>
-          <w:szCs w:val="28"/>
-        </w:rPr>
-      </w:pPr>
-    </w:p>
-    <w:p>
-      <w:pPr>
-        <w:rPr>
-          <w:sz w:val="28"/>
-          <w:szCs w:val="28"/>
-        </w:rPr>
-      </w:pPr>
-    </w:p>
-    <w:p>
-      <w:pPr>
-        <w:rPr>
-          <w:sz w:val="28"/>
-          <w:szCs w:val="28"/>
-        </w:rPr>
-      </w:pPr>
-    </w:p>
-    <w:p>
-      <w:pPr>
-        <w:rPr>
-          <w:sz w:val="28"/>
-          <w:szCs w:val="28"/>
-        </w:rPr>
-      </w:pPr>
-    </w:p>
-    <w:p>
-      <w:pPr>
-        <w:rPr>
-          <w:sz w:val="28"/>
-          <w:szCs w:val="28"/>
-        </w:rPr>
-      </w:pPr>
-    </w:p>
-    <w:p>
-      <w:pPr>
-        <w:rPr>
-          <w:sz w:val="28"/>
-          <w:szCs w:val="28"/>
-        </w:rPr>
-      </w:pPr>
-    </w:p>
-    <w:p>
-      <w:pPr>
-        <w:rPr>
-          <w:sz w:val="28"/>
-          <w:szCs w:val="28"/>
-        </w:rPr>
-      </w:pPr>
-    </w:p>
-    <w:p>
-      <w:pPr>
-        <w:rPr>
-          <w:sz w:val="28"/>
-          <w:szCs w:val="28"/>
-        </w:rPr>
-      </w:pPr>
-    </w:p>
-    <w:p>
-      <w:pPr>
-        <w:rPr>
-          <w:sz w:val="28"/>
-          <w:szCs w:val="28"/>
-        </w:rPr>
-      </w:pPr>
-    </w:p>
-    <w:p>
-      <w:pPr>
-        <w:rPr>
-          <w:sz w:val="28"/>
-          <w:szCs w:val="28"/>
-        </w:rPr>
-      </w:pPr>
-    </w:p>
-    <w:p>
-      <w:pPr>
-        <w:rPr>
-          <w:sz w:val="28"/>
-          <w:szCs w:val="28"/>
-        </w:rPr>
-      </w:pPr>
-    </w:p>
-    <w:p>
-      <w:pPr>
-        <w:rPr>
-          <w:sz w:val="28"/>
-          <w:szCs w:val="28"/>
-        </w:rPr>
-      </w:pPr>
-    </w:p>
-    <w:p>
-      <w:pPr>
-        <w:rPr>
-          <w:sz w:val="28"/>
-          <w:szCs w:val="28"/>
-        </w:rPr>
-      </w:pPr>
-    </w:p>
-    <w:p>
-      <w:pPr>
-        <w:rPr>
-          <w:sz w:val="28"/>
-          <w:szCs w:val="28"/>
-        </w:rPr>
-      </w:pPr>
-    </w:p>
-    <w:p>
-      <w:pPr>
-        <w:rPr>
-          <w:sz w:val="28"/>
-          <w:szCs w:val="28"/>
-        </w:rPr>
-      </w:pPr>
-    </w:p>
-    <w:p>
-      <w:pPr>
-        <w:rPr>
-          <w:sz w:val="28"/>
-          <w:szCs w:val="28"/>
-        </w:rPr>
-      </w:pPr>
-    </w:p>
-    <w:p>
-      <w:pPr>
-        <w:rPr>
-          <w:sz w:val="28"/>
-          <w:szCs w:val="28"/>
-        </w:rPr>
-      </w:pPr>
-    </w:p>
-    <w:p>
-      <w:pPr>
-        <w:rPr>
-          <w:sz w:val="28"/>
-          <w:szCs w:val="28"/>
-        </w:rPr>
-      </w:pPr>
-    </w:p>
-    <w:p>
-      <w:pPr>
-        <w:rPr>
-          <w:sz w:val="28"/>
-          <w:szCs w:val="28"/>
-        </w:rPr>
-      </w:pPr>
-    </w:p>
-    <w:p>
-      <w:pPr>
-        <w:rPr>
-          <w:sz w:val="28"/>
-          <w:szCs w:val="28"/>
-        </w:rPr>
-      </w:pPr>
-    </w:p>
-    <w:p>
-      <w:pPr>
-        <w:rPr>
-          <w:sz w:val="28"/>
-          <w:szCs w:val="28"/>
-        </w:rPr>
-      </w:pPr>
-    </w:p>
-    <w:p>
-      <w:pPr>
-        <w:rPr>
-          <w:sz w:val="28"/>
-          <w:szCs w:val="28"/>
-        </w:rPr>
-      </w:pPr>
-    </w:p>
-    <w:p>
-      <w:pPr>
-        <w:rPr>
-          <w:sz w:val="28"/>
-          <w:szCs w:val="28"/>
-        </w:rPr>
-      </w:pPr>
-    </w:p>
-    <w:p>
-      <w:pPr>
-        <w:rPr>
-          <w:sz w:val="28"/>
-          <w:szCs w:val="28"/>
-        </w:rPr>
-      </w:pPr>
-    </w:p>
-    <w:p>
-      <w:pPr>
-        <w:rPr>
-          <w:sz w:val="28"/>
-          <w:szCs w:val="28"/>
-        </w:rPr>
-      </w:pPr>
-    </w:p>
-    <w:p>
-      <w:pPr>
-        <w:rPr>
-          <w:sz w:val="28"/>
-          <w:szCs w:val="28"/>
-        </w:rPr>
-      </w:pPr>
-    </w:p>
-    <w:p>
-      <w:pPr>
-        <w:rPr>
-          <w:sz w:val="28"/>
-          <w:szCs w:val="28"/>
-        </w:rPr>
-      </w:pPr>
-    </w:p>
-    <w:p>
-      <w:pPr>
-        <w:rPr>
-          <w:sz w:val="28"/>
-          <w:szCs w:val="28"/>
-        </w:rPr>
-      </w:pPr>
-    </w:p>
-    <w:p>
-      <w:pPr>
-        <w:rPr>
-          <w:sz w:val="28"/>
-          <w:szCs w:val="28"/>
-        </w:rPr>
-      </w:pPr>
-    </w:p>
-    <w:p>
-      <w:pPr>
-        <w:rPr>
-          <w:sz w:val="28"/>
-          <w:szCs w:val="28"/>
-        </w:rPr>
-      </w:pPr>
-    </w:p>
-    <w:p>
-      <w:pPr>
-        <w:rPr>
-          <w:sz w:val="28"/>
-          <w:szCs w:val="28"/>
-        </w:rPr>
-      </w:pPr>
-    </w:p>
-    <w:p>
-      <w:pPr>
-        <w:rPr>
-          <w:sz w:val="28"/>
-          <w:szCs w:val="28"/>
-        </w:rPr>
-      </w:pPr>
-    </w:p>
-    <w:p>
-      <w:pPr>
-        <w:rPr>
-          <w:sz w:val="28"/>
-          <w:szCs w:val="28"/>
-        </w:rPr>
-      </w:pPr>
-    </w:p>
-    <w:p>
-      <w:pPr>
-        <w:rPr>
-          <w:sz w:val="28"/>
-          <w:szCs w:val="28"/>
-        </w:rPr>
-      </w:pPr>
-    </w:p>
-    <w:p>
-      <w:pPr>
-        <w:rPr>
-          <w:sz w:val="28"/>
-          <w:szCs w:val="28"/>
-        </w:rPr>
-      </w:pPr>
-    </w:p>
-    <w:p>
-      <w:pPr>
-        <w:rPr>
-          <w:sz w:val="28"/>
-          <w:szCs w:val="28"/>
-        </w:rPr>
-      </w:pPr>
-    </w:p>
-    <w:p>
-      <w:pPr>
-        <w:rPr>
-          <w:sz w:val="28"/>
-          <w:szCs w:val="28"/>
-        </w:rPr>
-      </w:pPr>
-    </w:p>
-    <w:p>
-      <w:pPr>
-        <w:rPr>
-          <w:sz w:val="28"/>
-          <w:szCs w:val="28"/>
-        </w:rPr>
-      </w:pPr>
-      <w:r>
-        <w:rPr>
-          <w:sz w:val="28"/>
-          <w:szCs w:val="28"/>
-        </w:rPr>
-        <w:drawing>
-          <wp:anchor distT="0" distB="0" distL="114300" distR="114300" simplePos="0" relativeHeight="251663360" behindDoc="0" locked="0" layoutInCell="1" allowOverlap="1" wp14:anchorId="47F9A31B" wp14:editId="58B32901">
-            <wp:simplePos x="0" y="0"/>
-            <wp:positionH relativeFrom="margin">
-              <wp:align>left</wp:align>
-            </wp:positionH>
-            <wp:positionV relativeFrom="paragraph">
-              <wp:posOffset>354511</wp:posOffset>
-            </wp:positionV>
-            <wp:extent cx="5867400" cy="7097395"/>
-            <wp:effectExtent l="0" t="0" r="0" b="8255"/>
-            <wp:wrapNone/>
-            <wp:docPr id="118290129" name="Picture 1"/>
-            <wp:cNvGraphicFramePr>
-              <a:graphicFrameLocks xmlns:a="http://schemas.openxmlformats.org/drawingml/2006/main" noChangeAspect="1"/>
-            </wp:cNvGraphicFramePr>
-            <a:graphic xmlns:a="http://schemas.openxmlformats.org/drawingml/2006/main">
-              <a:graphicData uri="http://schemas.openxmlformats.org/drawingml/2006/picture">
-                <pic:pic xmlns:pic="http://schemas.openxmlformats.org/drawingml/2006/picture">
-                  <pic:nvPicPr>
-                    <pic:cNvPr id="118290129" name=""/>
+                    <pic:cNvPr id="2038586180" name=""/>
                     <pic:cNvPicPr/>
                   </pic:nvPicPr>
                   <pic:blipFill>
@@ -1761,7 +1698,7 @@
                   <pic:spPr>
                     <a:xfrm>
                       <a:off x="0" y="0"/>
-                      <a:ext cx="5869405" cy="7099820"/>
+                      <a:ext cx="3966262" cy="6375371"/>
                     </a:xfrm>
                     <a:prstGeom prst="rect">
                       <a:avLst/>
@@ -1959,14 +1896,6 @@
     <w:p>
       <w:pPr>
         <w:rPr>
-          <w:sz w:val="28"/>
-          <w:szCs w:val="28"/>
-        </w:rPr>
-      </w:pPr>
-    </w:p>
-    <w:p>
-      <w:pPr>
-        <w:rPr>
           <w:b/>
           <w:bCs/>
           <w:sz w:val="32"/>
@@ -1990,24 +1919,32 @@
           <w:szCs w:val="28"/>
         </w:rPr>
       </w:pPr>
+    </w:p>
+    <w:p>
+      <w:pPr>
+        <w:rPr>
+          <w:sz w:val="28"/>
+          <w:szCs w:val="28"/>
+        </w:rPr>
+      </w:pPr>
       <w:r>
         <w:rPr>
           <w:sz w:val="28"/>
           <w:szCs w:val="28"/>
         </w:rPr>
         <w:drawing>
-          <wp:anchor distT="0" distB="0" distL="114300" distR="114300" simplePos="0" relativeHeight="251664384" behindDoc="0" locked="0" layoutInCell="1" allowOverlap="1" wp14:anchorId="7CAA6E2A" wp14:editId="393FD91F">
+          <wp:anchor distT="0" distB="0" distL="114300" distR="114300" simplePos="0" relativeHeight="251676672" behindDoc="0" locked="0" layoutInCell="1" allowOverlap="1" wp14:anchorId="092D64B8" wp14:editId="650A85D4">
             <wp:simplePos x="0" y="0"/>
             <wp:positionH relativeFrom="margin">
-              <wp:align>right</wp:align>
+              <wp:posOffset>-217715</wp:posOffset>
             </wp:positionH>
             <wp:positionV relativeFrom="paragraph">
-              <wp:posOffset>385717</wp:posOffset>
+              <wp:posOffset>181610</wp:posOffset>
             </wp:positionV>
-            <wp:extent cx="6247765" cy="3940629"/>
-            <wp:effectExtent l="0" t="0" r="635" b="3175"/>
+            <wp:extent cx="5943600" cy="2569029"/>
+            <wp:effectExtent l="0" t="0" r="0" b="3175"/>
             <wp:wrapNone/>
-            <wp:docPr id="2118899143" name="Picture 1"/>
+            <wp:docPr id="236866495" name="Picture 1"/>
             <wp:cNvGraphicFramePr>
               <a:graphicFrameLocks xmlns:a="http://schemas.openxmlformats.org/drawingml/2006/main" noChangeAspect="1"/>
             </wp:cNvGraphicFramePr>
@@ -2015,7 +1952,7 @@
               <a:graphicData uri="http://schemas.openxmlformats.org/drawingml/2006/picture">
                 <pic:pic xmlns:pic="http://schemas.openxmlformats.org/drawingml/2006/picture">
                   <pic:nvPicPr>
-                    <pic:cNvPr id="2118899143" name=""/>
+                    <pic:cNvPr id="236866495" name=""/>
                     <pic:cNvPicPr/>
                   </pic:nvPicPr>
                   <pic:blipFill>
@@ -2033,7 +1970,7 @@
                   <pic:spPr>
                     <a:xfrm>
                       <a:off x="0" y="0"/>
-                      <a:ext cx="6249719" cy="3941861"/>
+                      <a:ext cx="5943600" cy="2569029"/>
                     </a:xfrm>
                     <a:prstGeom prst="rect">
                       <a:avLst/>
@@ -2042,9 +1979,6 @@
                 </pic:pic>
               </a:graphicData>
             </a:graphic>
-            <wp14:sizeRelH relativeFrom="margin">
-              <wp14:pctWidth>0</wp14:pctWidth>
-            </wp14:sizeRelH>
             <wp14:sizeRelV relativeFrom="margin">
               <wp14:pctHeight>0</wp14:pctHeight>
             </wp14:sizeRelV>
@@ -2083,13 +2017,110 @@
           <w:szCs w:val="28"/>
         </w:rPr>
       </w:pPr>
-      <w:r>
-        <w:rPr>
-          <w:sz w:val="28"/>
-          <w:szCs w:val="28"/>
-        </w:rPr>
-        <w:br w:type="page"/>
-      </w:r>
+    </w:p>
+    <w:p>
+      <w:pPr>
+        <w:rPr>
+          <w:sz w:val="28"/>
+          <w:szCs w:val="28"/>
+        </w:rPr>
+      </w:pPr>
+    </w:p>
+    <w:p>
+      <w:pPr>
+        <w:rPr>
+          <w:sz w:val="28"/>
+          <w:szCs w:val="28"/>
+        </w:rPr>
+      </w:pPr>
+    </w:p>
+    <w:p>
+      <w:pPr>
+        <w:rPr>
+          <w:sz w:val="28"/>
+          <w:szCs w:val="28"/>
+        </w:rPr>
+      </w:pPr>
+    </w:p>
+    <w:p>
+      <w:pPr>
+        <w:rPr>
+          <w:sz w:val="28"/>
+          <w:szCs w:val="28"/>
+        </w:rPr>
+      </w:pPr>
+    </w:p>
+    <w:p>
+      <w:pPr>
+        <w:rPr>
+          <w:sz w:val="28"/>
+          <w:szCs w:val="28"/>
+        </w:rPr>
+      </w:pPr>
+    </w:p>
+    <w:p>
+      <w:pPr>
+        <w:rPr>
+          <w:sz w:val="28"/>
+          <w:szCs w:val="28"/>
+        </w:rPr>
+      </w:pPr>
+    </w:p>
+    <w:p>
+      <w:pPr>
+        <w:rPr>
+          <w:sz w:val="28"/>
+          <w:szCs w:val="28"/>
+        </w:rPr>
+      </w:pPr>
+    </w:p>
+    <w:p>
+      <w:pPr>
+        <w:rPr>
+          <w:sz w:val="28"/>
+          <w:szCs w:val="28"/>
+        </w:rPr>
+      </w:pPr>
+    </w:p>
+    <w:p>
+      <w:pPr>
+        <w:rPr>
+          <w:sz w:val="28"/>
+          <w:szCs w:val="28"/>
+        </w:rPr>
+      </w:pPr>
+    </w:p>
+    <w:p>
+      <w:pPr>
+        <w:rPr>
+          <w:sz w:val="28"/>
+          <w:szCs w:val="28"/>
+        </w:rPr>
+      </w:pPr>
+    </w:p>
+    <w:p>
+      <w:pPr>
+        <w:rPr>
+          <w:sz w:val="28"/>
+          <w:szCs w:val="28"/>
+        </w:rPr>
+      </w:pPr>
+    </w:p>
+    <w:p>
+      <w:pPr>
+        <w:rPr>
+          <w:sz w:val="28"/>
+          <w:szCs w:val="28"/>
+        </w:rPr>
+      </w:pPr>
+    </w:p>
+    <w:p>
+      <w:pPr>
+        <w:rPr>
+          <w:sz w:val="28"/>
+          <w:szCs w:val="28"/>
+        </w:rPr>
+      </w:pPr>
     </w:p>
     <w:p>
       <w:pPr>
@@ -2105,7 +2136,6 @@
           <w:sz w:val="32"/>
           <w:szCs w:val="32"/>
         </w:rPr>
-        <w:lastRenderedPageBreak/>
         <w:t xml:space="preserve">Lab </w:t>
       </w:r>
       <w:r>
@@ -2115,7 +2145,7 @@
           <w:sz w:val="32"/>
           <w:szCs w:val="32"/>
         </w:rPr>
-        <w:t>3</w:t>
+        <w:t>4</w:t>
       </w:r>
     </w:p>
     <w:p>
@@ -2137,7 +2167,7 @@
           <w:sz w:val="28"/>
           <w:szCs w:val="28"/>
         </w:rPr>
-        <w:t>Generalized N-Queens Problem</w:t>
+        <w:t>Topological Sort (Directed Version)</w:t>
       </w:r>
       <w:r>
         <w:rPr>
@@ -2148,58 +2178,57 @@
         </w:rPr>
         <w:br/>
       </w:r>
+    </w:p>
+    <w:p>
+      <w:pPr>
+        <w:pStyle w:val="ListParagraph"/>
+        <w:ind w:left="1080"/>
+        <w:rPr>
+          <w:sz w:val="28"/>
+          <w:szCs w:val="28"/>
+        </w:rPr>
+      </w:pPr>
       <w:r>
         <w:rPr>
-          <w:b/>
-          <w:bCs/>
-          <w:sz w:val="28"/>
-          <w:szCs w:val="28"/>
-        </w:rPr>
-        <w:br/>
+          <w:sz w:val="28"/>
+          <w:szCs w:val="28"/>
+        </w:rPr>
+        <w:t xml:space="preserve">Convert the given graph into a Directed Acyclic Graph (DAG) by making all edges point from lower to higher node numbers. Perform </w:t>
       </w:r>
       <w:r>
         <w:rPr>
           <w:sz w:val="28"/>
           <w:szCs w:val="28"/>
         </w:rPr>
-        <w:t>Generalize your solution to solve the N-Queens problem for any N given as input. Test it for N = 4, 6, 8, 10, and 12. Tabulate the number of solutions for each</w:t>
+        <w:br/>
+        <w:t>topological sorting using DFS and print the result</w:t>
       </w:r>
+    </w:p>
+    <w:p>
+      <w:pPr>
+        <w:rPr>
+          <w:sz w:val="28"/>
+          <w:szCs w:val="28"/>
+        </w:rPr>
+      </w:pPr>
       <w:r>
         <w:rPr>
           <w:sz w:val="28"/>
           <w:szCs w:val="28"/>
         </w:rPr>
-        <w:br/>
-        <w:t>value of N.</w:t>
-      </w:r>
-    </w:p>
-    <w:p>
-      <w:pPr>
-        <w:rPr>
-          <w:sz w:val="28"/>
-          <w:szCs w:val="28"/>
-        </w:rPr>
-      </w:pPr>
-      <w:r>
-        <w:rPr>
-          <w:b/>
-          <w:bCs/>
-          <w:sz w:val="28"/>
-          <w:szCs w:val="28"/>
-        </w:rPr>
         <w:drawing>
-          <wp:anchor distT="0" distB="0" distL="114300" distR="114300" simplePos="0" relativeHeight="251665408" behindDoc="0" locked="0" layoutInCell="1" allowOverlap="1" wp14:anchorId="1B6E0A87" wp14:editId="0613D4A9">
+          <wp:anchor distT="0" distB="0" distL="114300" distR="114300" simplePos="0" relativeHeight="251677696" behindDoc="0" locked="0" layoutInCell="1" allowOverlap="1" wp14:anchorId="255E2DF2" wp14:editId="55B835AD">
             <wp:simplePos x="0" y="0"/>
-            <wp:positionH relativeFrom="column">
-              <wp:posOffset>-271962</wp:posOffset>
+            <wp:positionH relativeFrom="margin">
+              <wp:align>right</wp:align>
             </wp:positionH>
             <wp:positionV relativeFrom="paragraph">
-              <wp:posOffset>25400</wp:posOffset>
+              <wp:posOffset>27940</wp:posOffset>
             </wp:positionV>
-            <wp:extent cx="5943600" cy="6530068"/>
-            <wp:effectExtent l="0" t="0" r="0" b="4445"/>
+            <wp:extent cx="5943600" cy="6386013"/>
+            <wp:effectExtent l="0" t="0" r="0" b="0"/>
             <wp:wrapNone/>
-            <wp:docPr id="1446929800" name="Picture 1"/>
+            <wp:docPr id="2007288399" name="Picture 1"/>
             <wp:cNvGraphicFramePr>
               <a:graphicFrameLocks xmlns:a="http://schemas.openxmlformats.org/drawingml/2006/main" noChangeAspect="1"/>
             </wp:cNvGraphicFramePr>
@@ -2207,7 +2236,7 @@
               <a:graphicData uri="http://schemas.openxmlformats.org/drawingml/2006/picture">
                 <pic:pic xmlns:pic="http://schemas.openxmlformats.org/drawingml/2006/picture">
                   <pic:nvPicPr>
-                    <pic:cNvPr id="1446929800" name=""/>
+                    <pic:cNvPr id="2007288399" name=""/>
                     <pic:cNvPicPr/>
                   </pic:nvPicPr>
                   <pic:blipFill>
@@ -2225,7 +2254,7 @@
                   <pic:spPr>
                     <a:xfrm>
                       <a:off x="0" y="0"/>
-                      <a:ext cx="5943600" cy="6530068"/>
+                      <a:ext cx="5943600" cy="6386013"/>
                     </a:xfrm>
                     <a:prstGeom prst="rect">
                       <a:avLst/>
@@ -2240,1372 +2269,105 @@
           </wp:anchor>
         </w:drawing>
       </w:r>
-      <w:r>
-        <w:rPr>
-          <w:b/>
-          <w:bCs/>
-          <w:sz w:val="28"/>
-          <w:szCs w:val="28"/>
-        </w:rPr>
-        <w:br/>
-      </w:r>
-    </w:p>
-    <w:p>
-      <w:pPr>
-        <w:rPr>
-          <w:sz w:val="28"/>
-          <w:szCs w:val="28"/>
-        </w:rPr>
-      </w:pPr>
-    </w:p>
-    <w:p>
-      <w:pPr>
-        <w:rPr>
-          <w:sz w:val="28"/>
-          <w:szCs w:val="28"/>
-        </w:rPr>
-      </w:pPr>
-    </w:p>
-    <w:p>
-      <w:pPr>
-        <w:rPr>
-          <w:sz w:val="28"/>
-          <w:szCs w:val="28"/>
-        </w:rPr>
-      </w:pPr>
-    </w:p>
-    <w:p>
-      <w:pPr>
-        <w:rPr>
-          <w:sz w:val="28"/>
-          <w:szCs w:val="28"/>
-        </w:rPr>
-      </w:pPr>
-    </w:p>
-    <w:p>
-      <w:pPr>
-        <w:rPr>
-          <w:sz w:val="28"/>
-          <w:szCs w:val="28"/>
-        </w:rPr>
-      </w:pPr>
-    </w:p>
-    <w:p>
-      <w:pPr>
-        <w:rPr>
-          <w:sz w:val="28"/>
-          <w:szCs w:val="28"/>
-        </w:rPr>
-      </w:pPr>
-    </w:p>
-    <w:p>
-      <w:pPr>
-        <w:rPr>
-          <w:sz w:val="28"/>
-          <w:szCs w:val="28"/>
-        </w:rPr>
-      </w:pPr>
-    </w:p>
-    <w:p>
-      <w:pPr>
-        <w:rPr>
-          <w:sz w:val="28"/>
-          <w:szCs w:val="28"/>
-        </w:rPr>
-      </w:pPr>
-    </w:p>
-    <w:p>
-      <w:pPr>
-        <w:rPr>
-          <w:sz w:val="28"/>
-          <w:szCs w:val="28"/>
-        </w:rPr>
-      </w:pPr>
-    </w:p>
-    <w:p>
-      <w:pPr>
-        <w:rPr>
-          <w:sz w:val="28"/>
-          <w:szCs w:val="28"/>
-        </w:rPr>
-      </w:pPr>
-    </w:p>
-    <w:p>
-      <w:pPr>
-        <w:rPr>
-          <w:sz w:val="28"/>
-          <w:szCs w:val="28"/>
-        </w:rPr>
-      </w:pPr>
-    </w:p>
-    <w:p>
-      <w:pPr>
-        <w:rPr>
-          <w:sz w:val="28"/>
-          <w:szCs w:val="28"/>
-        </w:rPr>
-      </w:pPr>
-    </w:p>
-    <w:p>
-      <w:pPr>
-        <w:rPr>
-          <w:sz w:val="28"/>
-          <w:szCs w:val="28"/>
-        </w:rPr>
-      </w:pPr>
-    </w:p>
-    <w:p>
-      <w:pPr>
-        <w:rPr>
-          <w:sz w:val="28"/>
-          <w:szCs w:val="28"/>
-        </w:rPr>
-      </w:pPr>
-    </w:p>
-    <w:p>
-      <w:pPr>
-        <w:rPr>
-          <w:sz w:val="28"/>
-          <w:szCs w:val="28"/>
-        </w:rPr>
-      </w:pPr>
-    </w:p>
-    <w:p>
-      <w:pPr>
-        <w:rPr>
-          <w:sz w:val="28"/>
-          <w:szCs w:val="28"/>
-        </w:rPr>
-      </w:pPr>
-    </w:p>
-    <w:p>
-      <w:pPr>
-        <w:rPr>
-          <w:sz w:val="28"/>
-          <w:szCs w:val="28"/>
-        </w:rPr>
-      </w:pPr>
-    </w:p>
-    <w:p>
-      <w:pPr>
-        <w:rPr>
-          <w:sz w:val="28"/>
-          <w:szCs w:val="28"/>
-        </w:rPr>
-      </w:pPr>
-    </w:p>
-    <w:p>
-      <w:pPr>
-        <w:rPr>
-          <w:sz w:val="28"/>
-          <w:szCs w:val="28"/>
-        </w:rPr>
-      </w:pPr>
-    </w:p>
-    <w:p>
-      <w:pPr>
-        <w:rPr>
-          <w:sz w:val="28"/>
-          <w:szCs w:val="28"/>
-        </w:rPr>
-      </w:pPr>
-    </w:p>
-    <w:p>
-      <w:pPr>
-        <w:rPr>
-          <w:sz w:val="28"/>
-          <w:szCs w:val="28"/>
-        </w:rPr>
-      </w:pPr>
-    </w:p>
-    <w:p>
-      <w:pPr>
-        <w:rPr>
-          <w:sz w:val="28"/>
-          <w:szCs w:val="28"/>
-        </w:rPr>
-      </w:pPr>
-    </w:p>
-    <w:p>
-      <w:pPr>
-        <w:rPr>
-          <w:sz w:val="28"/>
-          <w:szCs w:val="28"/>
-        </w:rPr>
-      </w:pPr>
-    </w:p>
-    <w:p>
-      <w:pPr>
-        <w:rPr>
-          <w:sz w:val="28"/>
-          <w:szCs w:val="28"/>
-        </w:rPr>
-      </w:pPr>
-    </w:p>
-    <w:p>
-      <w:pPr>
-        <w:rPr>
-          <w:sz w:val="28"/>
-          <w:szCs w:val="28"/>
-        </w:rPr>
-      </w:pPr>
-    </w:p>
-    <w:p>
-      <w:pPr>
-        <w:rPr>
-          <w:sz w:val="28"/>
-          <w:szCs w:val="28"/>
-        </w:rPr>
-      </w:pPr>
-    </w:p>
-    <w:p>
-      <w:pPr>
-        <w:rPr>
-          <w:sz w:val="28"/>
-          <w:szCs w:val="28"/>
-        </w:rPr>
-      </w:pPr>
-    </w:p>
-    <w:p>
-      <w:pPr>
-        <w:rPr>
-          <w:sz w:val="28"/>
-          <w:szCs w:val="28"/>
-        </w:rPr>
-      </w:pPr>
-    </w:p>
-    <w:p>
-      <w:pPr>
-        <w:rPr>
-          <w:sz w:val="28"/>
-          <w:szCs w:val="28"/>
-        </w:rPr>
-      </w:pPr>
-    </w:p>
-    <w:p>
-      <w:pPr>
-        <w:rPr>
-          <w:sz w:val="28"/>
-          <w:szCs w:val="28"/>
-        </w:rPr>
-      </w:pPr>
-    </w:p>
-    <w:p>
-      <w:pPr>
-        <w:rPr>
-          <w:sz w:val="28"/>
-          <w:szCs w:val="28"/>
-        </w:rPr>
-      </w:pPr>
-    </w:p>
-    <w:p>
-      <w:pPr>
-        <w:rPr>
-          <w:sz w:val="28"/>
-          <w:szCs w:val="28"/>
-        </w:rPr>
-      </w:pPr>
-    </w:p>
-    <w:p>
-      <w:pPr>
-        <w:rPr>
-          <w:sz w:val="28"/>
-          <w:szCs w:val="28"/>
-        </w:rPr>
-      </w:pPr>
-    </w:p>
-    <w:p>
-      <w:pPr>
-        <w:rPr>
-          <w:sz w:val="28"/>
-          <w:szCs w:val="28"/>
-        </w:rPr>
-      </w:pPr>
-    </w:p>
-    <w:p>
-      <w:pPr>
-        <w:rPr>
-          <w:sz w:val="28"/>
-          <w:szCs w:val="28"/>
-        </w:rPr>
-      </w:pPr>
-    </w:p>
-    <w:p>
-      <w:pPr>
-        <w:rPr>
-          <w:sz w:val="28"/>
-          <w:szCs w:val="28"/>
-        </w:rPr>
-      </w:pPr>
-    </w:p>
-    <w:p>
-      <w:pPr>
-        <w:rPr>
-          <w:sz w:val="28"/>
-          <w:szCs w:val="28"/>
-        </w:rPr>
-      </w:pPr>
-    </w:p>
-    <w:p>
-      <w:pPr>
-        <w:rPr>
-          <w:sz w:val="28"/>
-          <w:szCs w:val="28"/>
-        </w:rPr>
-      </w:pPr>
-    </w:p>
-    <w:p>
-      <w:pPr>
-        <w:rPr>
-          <w:sz w:val="28"/>
-          <w:szCs w:val="28"/>
-        </w:rPr>
-      </w:pPr>
-    </w:p>
-    <w:p>
-      <w:pPr>
-        <w:rPr>
-          <w:sz w:val="28"/>
-          <w:szCs w:val="28"/>
-        </w:rPr>
-      </w:pPr>
-    </w:p>
-    <w:p>
-      <w:pPr>
-        <w:rPr>
-          <w:sz w:val="28"/>
-          <w:szCs w:val="28"/>
-        </w:rPr>
-      </w:pPr>
-    </w:p>
-    <w:p>
-      <w:pPr>
-        <w:rPr>
-          <w:sz w:val="28"/>
-          <w:szCs w:val="28"/>
-        </w:rPr>
-      </w:pPr>
-    </w:p>
-    <w:p>
-      <w:pPr>
-        <w:rPr>
-          <w:sz w:val="28"/>
-          <w:szCs w:val="28"/>
-        </w:rPr>
-      </w:pPr>
-    </w:p>
-    <w:p>
-      <w:pPr>
-        <w:rPr>
-          <w:sz w:val="28"/>
-          <w:szCs w:val="28"/>
-        </w:rPr>
-      </w:pPr>
-    </w:p>
-    <w:p>
-      <w:pPr>
-        <w:rPr>
-          <w:sz w:val="28"/>
-          <w:szCs w:val="28"/>
-        </w:rPr>
-      </w:pPr>
-      <w:r>
-        <w:rPr>
-          <w:sz w:val="28"/>
-          <w:szCs w:val="28"/>
-        </w:rPr>
-        <w:drawing>
-          <wp:anchor distT="0" distB="0" distL="114300" distR="114300" simplePos="0" relativeHeight="251666432" behindDoc="0" locked="0" layoutInCell="1" allowOverlap="1" wp14:anchorId="1F056CC9" wp14:editId="16705F3F">
-            <wp:simplePos x="0" y="0"/>
-            <wp:positionH relativeFrom="margin">
-              <wp:align>right</wp:align>
-            </wp:positionH>
-            <wp:positionV relativeFrom="paragraph">
-              <wp:posOffset>357414</wp:posOffset>
-            </wp:positionV>
-            <wp:extent cx="6335486" cy="4038600"/>
-            <wp:effectExtent l="0" t="0" r="8255" b="0"/>
-            <wp:wrapNone/>
-            <wp:docPr id="737828612" name="Picture 1"/>
-            <wp:cNvGraphicFramePr>
-              <a:graphicFrameLocks xmlns:a="http://schemas.openxmlformats.org/drawingml/2006/main" noChangeAspect="1"/>
-            </wp:cNvGraphicFramePr>
-            <a:graphic xmlns:a="http://schemas.openxmlformats.org/drawingml/2006/main">
-              <a:graphicData uri="http://schemas.openxmlformats.org/drawingml/2006/picture">
-                <pic:pic xmlns:pic="http://schemas.openxmlformats.org/drawingml/2006/picture">
-                  <pic:nvPicPr>
-                    <pic:cNvPr id="737828612" name=""/>
-                    <pic:cNvPicPr/>
-                  </pic:nvPicPr>
-                  <pic:blipFill>
-                    <a:blip r:embed="rId15">
-                      <a:extLst>
-                        <a:ext uri="{28A0092B-C50C-407E-A947-70E740481C1C}">
-                          <a14:useLocalDpi xmlns:a14="http://schemas.microsoft.com/office/drawing/2010/main" val="0"/>
-                        </a:ext>
-                      </a:extLst>
-                    </a:blip>
-                    <a:stretch>
-                      <a:fillRect/>
-                    </a:stretch>
-                  </pic:blipFill>
-                  <pic:spPr>
-                    <a:xfrm>
-                      <a:off x="0" y="0"/>
-                      <a:ext cx="6335486" cy="4038600"/>
-                    </a:xfrm>
-                    <a:prstGeom prst="rect">
-                      <a:avLst/>
-                    </a:prstGeom>
-                  </pic:spPr>
-                </pic:pic>
-              </a:graphicData>
-            </a:graphic>
-            <wp14:sizeRelH relativeFrom="margin">
-              <wp14:pctWidth>0</wp14:pctWidth>
-            </wp14:sizeRelH>
-            <wp14:sizeRelV relativeFrom="margin">
-              <wp14:pctHeight>0</wp14:pctHeight>
-            </wp14:sizeRelV>
-          </wp:anchor>
-        </w:drawing>
-      </w:r>
-    </w:p>
-    <w:p>
-      <w:pPr>
-        <w:rPr>
-          <w:sz w:val="28"/>
-          <w:szCs w:val="28"/>
-        </w:rPr>
-      </w:pPr>
-    </w:p>
-    <w:p>
-      <w:pPr>
-        <w:rPr>
-          <w:sz w:val="28"/>
-          <w:szCs w:val="28"/>
-        </w:rPr>
-      </w:pPr>
-    </w:p>
-    <w:p>
-      <w:pPr>
-        <w:rPr>
-          <w:sz w:val="28"/>
-          <w:szCs w:val="28"/>
-        </w:rPr>
-      </w:pPr>
-    </w:p>
-    <w:p>
-      <w:pPr>
-        <w:rPr>
-          <w:sz w:val="28"/>
-          <w:szCs w:val="28"/>
-        </w:rPr>
-      </w:pPr>
-    </w:p>
-    <w:p>
-      <w:pPr>
-        <w:rPr>
-          <w:sz w:val="28"/>
-          <w:szCs w:val="28"/>
-        </w:rPr>
-      </w:pPr>
-    </w:p>
-    <w:p>
-      <w:pPr>
-        <w:rPr>
-          <w:sz w:val="28"/>
-          <w:szCs w:val="28"/>
-        </w:rPr>
-      </w:pPr>
-    </w:p>
-    <w:p>
-      <w:pPr>
-        <w:rPr>
-          <w:sz w:val="28"/>
-          <w:szCs w:val="28"/>
-        </w:rPr>
-      </w:pPr>
-    </w:p>
-    <w:p>
-      <w:pPr>
-        <w:rPr>
-          <w:sz w:val="28"/>
-          <w:szCs w:val="28"/>
-        </w:rPr>
-      </w:pPr>
-    </w:p>
-    <w:p>
-      <w:pPr>
-        <w:rPr>
-          <w:sz w:val="28"/>
-          <w:szCs w:val="28"/>
-        </w:rPr>
-      </w:pPr>
-    </w:p>
-    <w:p>
-      <w:pPr>
-        <w:rPr>
-          <w:sz w:val="28"/>
-          <w:szCs w:val="28"/>
-        </w:rPr>
-      </w:pPr>
-    </w:p>
-    <w:p>
-      <w:pPr>
-        <w:rPr>
-          <w:sz w:val="28"/>
-          <w:szCs w:val="28"/>
-        </w:rPr>
-      </w:pPr>
-    </w:p>
-    <w:p>
-      <w:pPr>
-        <w:rPr>
-          <w:sz w:val="28"/>
-          <w:szCs w:val="28"/>
-        </w:rPr>
-      </w:pPr>
-    </w:p>
-    <w:p>
-      <w:pPr>
-        <w:rPr>
-          <w:sz w:val="28"/>
-          <w:szCs w:val="28"/>
-        </w:rPr>
-      </w:pPr>
-    </w:p>
-    <w:p>
-      <w:pPr>
-        <w:rPr>
-          <w:sz w:val="28"/>
-          <w:szCs w:val="28"/>
-        </w:rPr>
-      </w:pPr>
-    </w:p>
-    <w:p>
-      <w:pPr>
-        <w:rPr>
-          <w:sz w:val="28"/>
-          <w:szCs w:val="28"/>
-        </w:rPr>
-      </w:pPr>
-    </w:p>
-    <w:p>
-      <w:pPr>
-        <w:rPr>
-          <w:sz w:val="28"/>
-          <w:szCs w:val="28"/>
-        </w:rPr>
-      </w:pPr>
-    </w:p>
-    <w:p>
-      <w:pPr>
-        <w:rPr>
-          <w:sz w:val="28"/>
-          <w:szCs w:val="28"/>
-        </w:rPr>
-      </w:pPr>
-    </w:p>
-    <w:p>
-      <w:pPr>
-        <w:rPr>
-          <w:sz w:val="28"/>
-          <w:szCs w:val="28"/>
-        </w:rPr>
-      </w:pPr>
-    </w:p>
-    <w:p>
-      <w:pPr>
-        <w:rPr>
-          <w:sz w:val="28"/>
-          <w:szCs w:val="28"/>
-        </w:rPr>
-      </w:pPr>
-    </w:p>
-    <w:p>
-      <w:pPr>
-        <w:rPr>
-          <w:sz w:val="28"/>
-          <w:szCs w:val="28"/>
-        </w:rPr>
-      </w:pPr>
-    </w:p>
-    <w:p>
-      <w:pPr>
-        <w:rPr>
-          <w:sz w:val="28"/>
-          <w:szCs w:val="28"/>
-        </w:rPr>
-      </w:pPr>
-    </w:p>
-    <w:p>
-      <w:pPr>
-        <w:rPr>
-          <w:sz w:val="28"/>
-          <w:szCs w:val="28"/>
-        </w:rPr>
-      </w:pPr>
-    </w:p>
-    <w:p>
-      <w:pPr>
-        <w:rPr>
-          <w:sz w:val="28"/>
-          <w:szCs w:val="28"/>
-        </w:rPr>
-      </w:pPr>
-    </w:p>
-    <w:p>
-      <w:pPr>
-        <w:rPr>
-          <w:b/>
-          <w:bCs/>
-          <w:sz w:val="32"/>
-          <w:szCs w:val="32"/>
-        </w:rPr>
-      </w:pPr>
-      <w:r>
-        <w:rPr>
-          <w:b/>
-          <w:bCs/>
-          <w:sz w:val="32"/>
-          <w:szCs w:val="32"/>
-        </w:rPr>
-        <w:t xml:space="preserve">OUTPUT: </w:t>
-      </w:r>
-    </w:p>
-    <w:p>
-      <w:pPr>
-        <w:rPr>
-          <w:sz w:val="28"/>
-          <w:szCs w:val="28"/>
-        </w:rPr>
-      </w:pPr>
-      <w:r>
-        <w:rPr>
-          <w:sz w:val="28"/>
-          <w:szCs w:val="28"/>
-        </w:rPr>
-        <w:drawing>
-          <wp:anchor distT="0" distB="0" distL="114300" distR="114300" simplePos="0" relativeHeight="251667456" behindDoc="0" locked="0" layoutInCell="1" allowOverlap="1" wp14:anchorId="2C52FBB8" wp14:editId="2BAB77C3">
-            <wp:simplePos x="0" y="0"/>
-            <wp:positionH relativeFrom="margin">
-              <wp:posOffset>-413657</wp:posOffset>
-            </wp:positionH>
-            <wp:positionV relativeFrom="paragraph">
-              <wp:posOffset>214449</wp:posOffset>
-            </wp:positionV>
-            <wp:extent cx="6356597" cy="3537857"/>
-            <wp:effectExtent l="0" t="0" r="6350" b="5715"/>
-            <wp:wrapNone/>
-            <wp:docPr id="612522055" name="Picture 1"/>
-            <wp:cNvGraphicFramePr>
-              <a:graphicFrameLocks xmlns:a="http://schemas.openxmlformats.org/drawingml/2006/main" noChangeAspect="1"/>
-            </wp:cNvGraphicFramePr>
-            <a:graphic xmlns:a="http://schemas.openxmlformats.org/drawingml/2006/main">
-              <a:graphicData uri="http://schemas.openxmlformats.org/drawingml/2006/picture">
-                <pic:pic xmlns:pic="http://schemas.openxmlformats.org/drawingml/2006/picture">
-                  <pic:nvPicPr>
-                    <pic:cNvPr id="612522055" name=""/>
-                    <pic:cNvPicPr/>
-                  </pic:nvPicPr>
-                  <pic:blipFill>
-                    <a:blip r:embed="rId16">
-                      <a:extLst>
-                        <a:ext uri="{28A0092B-C50C-407E-A947-70E740481C1C}">
-                          <a14:useLocalDpi xmlns:a14="http://schemas.microsoft.com/office/drawing/2010/main" val="0"/>
-                        </a:ext>
-                      </a:extLst>
-                    </a:blip>
-                    <a:stretch>
-                      <a:fillRect/>
-                    </a:stretch>
-                  </pic:blipFill>
-                  <pic:spPr>
-                    <a:xfrm>
-                      <a:off x="0" y="0"/>
-                      <a:ext cx="6361948" cy="3540835"/>
-                    </a:xfrm>
-                    <a:prstGeom prst="rect">
-                      <a:avLst/>
-                    </a:prstGeom>
-                  </pic:spPr>
-                </pic:pic>
-              </a:graphicData>
-            </a:graphic>
-            <wp14:sizeRelH relativeFrom="margin">
-              <wp14:pctWidth>0</wp14:pctWidth>
-            </wp14:sizeRelH>
-            <wp14:sizeRelV relativeFrom="margin">
-              <wp14:pctHeight>0</wp14:pctHeight>
-            </wp14:sizeRelV>
-          </wp:anchor>
-        </w:drawing>
-      </w:r>
-    </w:p>
-    <w:p>
-      <w:pPr>
-        <w:rPr>
-          <w:sz w:val="28"/>
-          <w:szCs w:val="28"/>
-        </w:rPr>
-      </w:pPr>
-    </w:p>
-    <w:p>
-      <w:pPr>
-        <w:rPr>
-          <w:sz w:val="28"/>
-          <w:szCs w:val="28"/>
-        </w:rPr>
-      </w:pPr>
-    </w:p>
-    <w:p>
-      <w:pPr>
-        <w:rPr>
-          <w:sz w:val="28"/>
-          <w:szCs w:val="28"/>
-        </w:rPr>
-      </w:pPr>
-    </w:p>
-    <w:p>
-      <w:pPr>
-        <w:rPr>
-          <w:sz w:val="28"/>
-          <w:szCs w:val="28"/>
-        </w:rPr>
-      </w:pPr>
-    </w:p>
-    <w:p>
-      <w:pPr>
-        <w:rPr>
-          <w:sz w:val="28"/>
-          <w:szCs w:val="28"/>
-        </w:rPr>
-      </w:pPr>
-    </w:p>
-    <w:p>
-      <w:pPr>
-        <w:rPr>
-          <w:sz w:val="28"/>
-          <w:szCs w:val="28"/>
-        </w:rPr>
-      </w:pPr>
-    </w:p>
-    <w:p>
-      <w:pPr>
-        <w:rPr>
-          <w:sz w:val="28"/>
-          <w:szCs w:val="28"/>
-        </w:rPr>
-      </w:pPr>
-    </w:p>
-    <w:p>
-      <w:pPr>
-        <w:rPr>
-          <w:sz w:val="28"/>
-          <w:szCs w:val="28"/>
-        </w:rPr>
-      </w:pPr>
-    </w:p>
-    <w:p>
-      <w:pPr>
-        <w:rPr>
-          <w:sz w:val="28"/>
-          <w:szCs w:val="28"/>
-        </w:rPr>
-      </w:pPr>
-    </w:p>
-    <w:p>
-      <w:pPr>
-        <w:rPr>
-          <w:sz w:val="28"/>
-          <w:szCs w:val="28"/>
-        </w:rPr>
-      </w:pPr>
-    </w:p>
-    <w:p>
-      <w:pPr>
-        <w:rPr>
-          <w:sz w:val="28"/>
-          <w:szCs w:val="28"/>
-        </w:rPr>
-      </w:pPr>
-    </w:p>
-    <w:p>
-      <w:pPr>
-        <w:rPr>
-          <w:sz w:val="28"/>
-          <w:szCs w:val="28"/>
-        </w:rPr>
-      </w:pPr>
-    </w:p>
-    <w:p>
-      <w:pPr>
-        <w:rPr>
-          <w:sz w:val="28"/>
-          <w:szCs w:val="28"/>
-        </w:rPr>
-      </w:pPr>
-    </w:p>
-    <w:p>
-      <w:pPr>
-        <w:rPr>
-          <w:sz w:val="28"/>
-          <w:szCs w:val="28"/>
-        </w:rPr>
-      </w:pPr>
-    </w:p>
-    <w:p>
-      <w:pPr>
-        <w:rPr>
-          <w:sz w:val="28"/>
-          <w:szCs w:val="28"/>
-        </w:rPr>
-      </w:pPr>
-    </w:p>
-    <w:p>
-      <w:pPr>
-        <w:rPr>
-          <w:sz w:val="28"/>
-          <w:szCs w:val="28"/>
-        </w:rPr>
-      </w:pPr>
-    </w:p>
-    <w:p>
-      <w:pPr>
-        <w:rPr>
-          <w:sz w:val="28"/>
-          <w:szCs w:val="28"/>
-        </w:rPr>
-      </w:pPr>
-    </w:p>
-    <w:p>
-      <w:pPr>
-        <w:rPr>
-          <w:sz w:val="32"/>
-          <w:szCs w:val="32"/>
-        </w:rPr>
-      </w:pPr>
-      <w:r>
-        <w:rPr>
-          <w:b/>
-          <w:bCs/>
-          <w:sz w:val="32"/>
-          <w:szCs w:val="32"/>
-        </w:rPr>
-        <w:t xml:space="preserve">Lab </w:t>
-      </w:r>
-      <w:r>
-        <w:rPr>
-          <w:b/>
-          <w:bCs/>
-          <w:sz w:val="32"/>
-          <w:szCs w:val="32"/>
-        </w:rPr>
-        <w:t>4</w:t>
-      </w:r>
-    </w:p>
-    <w:p>
-      <w:pPr>
-        <w:pStyle w:val="ListParagraph"/>
-        <w:numPr>
-          <w:ilvl w:val="0"/>
-          <w:numId w:val="25"/>
-        </w:numPr>
-        <w:rPr>
-          <w:sz w:val="28"/>
-          <w:szCs w:val="28"/>
-        </w:rPr>
-      </w:pPr>
-      <w:r>
-        <w:rPr>
-          <w:b/>
-          <w:bCs/>
-          <w:sz w:val="28"/>
-          <w:szCs w:val="28"/>
-        </w:rPr>
-        <w:t>Pre-Placed Queen Constraint</w:t>
-      </w:r>
-      <w:r>
-        <w:rPr>
-          <w:b/>
-          <w:bCs/>
-          <w:sz w:val="28"/>
-          <w:szCs w:val="28"/>
-        </w:rPr>
-        <w:br/>
-      </w:r>
-      <w:r>
-        <w:rPr>
-          <w:sz w:val="28"/>
-          <w:szCs w:val="28"/>
-        </w:rPr>
-        <w:br/>
-        <w:t>Modify the program so that one queen is pre-placed at position (0, 3) — row 0, column 3. How many valid solutions exist with this fixed constraint?</w:t>
-      </w:r>
-    </w:p>
-    <w:p>
-      <w:pPr>
-        <w:rPr>
-          <w:sz w:val="28"/>
-          <w:szCs w:val="28"/>
-        </w:rPr>
-      </w:pPr>
-      <w:r>
-        <w:rPr>
-          <w:sz w:val="28"/>
-          <w:szCs w:val="28"/>
-        </w:rPr>
-        <w:drawing>
-          <wp:anchor distT="0" distB="0" distL="114300" distR="114300" simplePos="0" relativeHeight="251668480" behindDoc="0" locked="0" layoutInCell="1" allowOverlap="1" wp14:anchorId="44C070B7" wp14:editId="76D910EE">
-            <wp:simplePos x="0" y="0"/>
-            <wp:positionH relativeFrom="column">
-              <wp:posOffset>-250371</wp:posOffset>
-            </wp:positionH>
-            <wp:positionV relativeFrom="paragraph">
-              <wp:posOffset>180703</wp:posOffset>
-            </wp:positionV>
-            <wp:extent cx="6007735" cy="5878203"/>
-            <wp:effectExtent l="0" t="0" r="0" b="8255"/>
-            <wp:wrapNone/>
-            <wp:docPr id="477391005" name="Picture 1"/>
-            <wp:cNvGraphicFramePr>
-              <a:graphicFrameLocks xmlns:a="http://schemas.openxmlformats.org/drawingml/2006/main" noChangeAspect="1"/>
-            </wp:cNvGraphicFramePr>
-            <a:graphic xmlns:a="http://schemas.openxmlformats.org/drawingml/2006/main">
-              <a:graphicData uri="http://schemas.openxmlformats.org/drawingml/2006/picture">
-                <pic:pic xmlns:pic="http://schemas.openxmlformats.org/drawingml/2006/picture">
-                  <pic:nvPicPr>
-                    <pic:cNvPr id="477391005" name=""/>
-                    <pic:cNvPicPr/>
-                  </pic:nvPicPr>
-                  <pic:blipFill>
-                    <a:blip r:embed="rId17">
-                      <a:extLst>
-                        <a:ext uri="{28A0092B-C50C-407E-A947-70E740481C1C}">
-                          <a14:useLocalDpi xmlns:a14="http://schemas.microsoft.com/office/drawing/2010/main" val="0"/>
-                        </a:ext>
-                      </a:extLst>
-                    </a:blip>
-                    <a:stretch>
-                      <a:fillRect/>
-                    </a:stretch>
-                  </pic:blipFill>
-                  <pic:spPr>
-                    <a:xfrm>
-                      <a:off x="0" y="0"/>
-                      <a:ext cx="6015144" cy="5885452"/>
-                    </a:xfrm>
-                    <a:prstGeom prst="rect">
-                      <a:avLst/>
-                    </a:prstGeom>
-                  </pic:spPr>
-                </pic:pic>
-              </a:graphicData>
-            </a:graphic>
-            <wp14:sizeRelH relativeFrom="margin">
-              <wp14:pctWidth>0</wp14:pctWidth>
-            </wp14:sizeRelH>
-            <wp14:sizeRelV relativeFrom="margin">
-              <wp14:pctHeight>0</wp14:pctHeight>
-            </wp14:sizeRelV>
-          </wp:anchor>
-        </w:drawing>
-      </w:r>
-    </w:p>
-    <w:p>
-      <w:pPr>
-        <w:rPr>
-          <w:sz w:val="28"/>
-          <w:szCs w:val="28"/>
-        </w:rPr>
-      </w:pPr>
-    </w:p>
-    <w:p>
-      <w:pPr>
-        <w:rPr>
-          <w:sz w:val="28"/>
-          <w:szCs w:val="28"/>
-        </w:rPr>
-      </w:pPr>
-    </w:p>
-    <w:p>
-      <w:pPr>
-        <w:rPr>
-          <w:sz w:val="28"/>
-          <w:szCs w:val="28"/>
-        </w:rPr>
-      </w:pPr>
-    </w:p>
-    <w:p>
-      <w:pPr>
-        <w:rPr>
-          <w:sz w:val="28"/>
-          <w:szCs w:val="28"/>
-        </w:rPr>
-      </w:pPr>
-    </w:p>
-    <w:p>
-      <w:pPr>
-        <w:rPr>
-          <w:sz w:val="28"/>
-          <w:szCs w:val="28"/>
-        </w:rPr>
-      </w:pPr>
-    </w:p>
-    <w:p>
-      <w:pPr>
-        <w:rPr>
-          <w:sz w:val="28"/>
-          <w:szCs w:val="28"/>
-        </w:rPr>
-      </w:pPr>
-    </w:p>
-    <w:p>
-      <w:pPr>
-        <w:rPr>
-          <w:sz w:val="28"/>
-          <w:szCs w:val="28"/>
-        </w:rPr>
-      </w:pPr>
-    </w:p>
-    <w:p>
-      <w:pPr>
-        <w:rPr>
-          <w:sz w:val="28"/>
-          <w:szCs w:val="28"/>
-        </w:rPr>
-      </w:pPr>
-    </w:p>
-    <w:p>
-      <w:pPr>
-        <w:rPr>
-          <w:sz w:val="28"/>
-          <w:szCs w:val="28"/>
-        </w:rPr>
-      </w:pPr>
-    </w:p>
-    <w:p>
-      <w:pPr>
-        <w:rPr>
-          <w:sz w:val="28"/>
-          <w:szCs w:val="28"/>
-        </w:rPr>
-      </w:pPr>
-    </w:p>
-    <w:p>
-      <w:pPr>
-        <w:rPr>
-          <w:sz w:val="28"/>
-          <w:szCs w:val="28"/>
-        </w:rPr>
-      </w:pPr>
-    </w:p>
-    <w:p>
-      <w:pPr>
-        <w:rPr>
-          <w:sz w:val="28"/>
-          <w:szCs w:val="28"/>
-        </w:rPr>
-      </w:pPr>
-    </w:p>
-    <w:p>
-      <w:pPr>
-        <w:rPr>
-          <w:sz w:val="28"/>
-          <w:szCs w:val="28"/>
-        </w:rPr>
-      </w:pPr>
-    </w:p>
-    <w:p>
-      <w:pPr>
-        <w:rPr>
-          <w:sz w:val="28"/>
-          <w:szCs w:val="28"/>
-        </w:rPr>
-      </w:pPr>
-    </w:p>
-    <w:p>
-      <w:pPr>
-        <w:rPr>
-          <w:sz w:val="28"/>
-          <w:szCs w:val="28"/>
-        </w:rPr>
-      </w:pPr>
-    </w:p>
-    <w:p>
-      <w:pPr>
-        <w:rPr>
-          <w:sz w:val="28"/>
-          <w:szCs w:val="28"/>
-        </w:rPr>
-      </w:pPr>
-    </w:p>
-    <w:p>
-      <w:pPr>
-        <w:rPr>
-          <w:sz w:val="28"/>
-          <w:szCs w:val="28"/>
-        </w:rPr>
-      </w:pPr>
-    </w:p>
-    <w:p>
-      <w:pPr>
-        <w:rPr>
-          <w:sz w:val="28"/>
-          <w:szCs w:val="28"/>
-        </w:rPr>
-      </w:pPr>
-    </w:p>
-    <w:p>
-      <w:pPr>
-        <w:rPr>
-          <w:sz w:val="28"/>
-          <w:szCs w:val="28"/>
-        </w:rPr>
-      </w:pPr>
-    </w:p>
-    <w:p>
-      <w:pPr>
-        <w:rPr>
-          <w:sz w:val="28"/>
-          <w:szCs w:val="28"/>
-        </w:rPr>
-      </w:pPr>
-    </w:p>
-    <w:p>
-      <w:pPr>
-        <w:rPr>
-          <w:sz w:val="28"/>
-          <w:szCs w:val="28"/>
-        </w:rPr>
-      </w:pPr>
-    </w:p>
-    <w:p>
-      <w:pPr>
-        <w:rPr>
-          <w:sz w:val="28"/>
-          <w:szCs w:val="28"/>
-        </w:rPr>
-      </w:pPr>
-    </w:p>
-    <w:p>
-      <w:pPr>
-        <w:rPr>
-          <w:sz w:val="28"/>
-          <w:szCs w:val="28"/>
-        </w:rPr>
-      </w:pPr>
-    </w:p>
-    <w:p>
-      <w:pPr>
-        <w:rPr>
-          <w:sz w:val="28"/>
-          <w:szCs w:val="28"/>
-        </w:rPr>
-      </w:pPr>
-    </w:p>
-    <w:p>
-      <w:pPr>
-        <w:rPr>
-          <w:sz w:val="28"/>
-          <w:szCs w:val="28"/>
-        </w:rPr>
-      </w:pPr>
-    </w:p>
-    <w:p>
-      <w:pPr>
-        <w:rPr>
-          <w:sz w:val="28"/>
-          <w:szCs w:val="28"/>
-        </w:rPr>
-      </w:pPr>
-    </w:p>
-    <w:p>
-      <w:pPr>
-        <w:rPr>
-          <w:sz w:val="28"/>
-          <w:szCs w:val="28"/>
-        </w:rPr>
-      </w:pPr>
-    </w:p>
-    <w:p>
-      <w:pPr>
-        <w:rPr>
-          <w:sz w:val="28"/>
-          <w:szCs w:val="28"/>
-        </w:rPr>
-      </w:pPr>
-    </w:p>
-    <w:p>
-      <w:pPr>
-        <w:rPr>
-          <w:sz w:val="28"/>
-          <w:szCs w:val="28"/>
-        </w:rPr>
-      </w:pPr>
-    </w:p>
-    <w:p>
-      <w:pPr>
-        <w:rPr>
-          <w:sz w:val="28"/>
-          <w:szCs w:val="28"/>
-        </w:rPr>
-      </w:pPr>
-    </w:p>
-    <w:p>
-      <w:pPr>
-        <w:rPr>
-          <w:sz w:val="28"/>
-          <w:szCs w:val="28"/>
-        </w:rPr>
-      </w:pPr>
-    </w:p>
-    <w:p>
-      <w:pPr>
-        <w:rPr>
-          <w:sz w:val="28"/>
-          <w:szCs w:val="28"/>
-        </w:rPr>
-      </w:pPr>
-    </w:p>
-    <w:p>
-      <w:pPr>
-        <w:rPr>
-          <w:sz w:val="28"/>
-          <w:szCs w:val="28"/>
-        </w:rPr>
-      </w:pPr>
-    </w:p>
-    <w:p>
-      <w:pPr>
-        <w:rPr>
-          <w:sz w:val="28"/>
-          <w:szCs w:val="28"/>
-        </w:rPr>
-      </w:pPr>
-    </w:p>
-    <w:p>
-      <w:pPr>
-        <w:rPr>
-          <w:sz w:val="28"/>
-          <w:szCs w:val="28"/>
-        </w:rPr>
-      </w:pPr>
-    </w:p>
-    <w:p>
-      <w:pPr>
-        <w:rPr>
-          <w:sz w:val="28"/>
-          <w:szCs w:val="28"/>
-        </w:rPr>
-      </w:pPr>
-    </w:p>
-    <w:p>
-      <w:pPr>
-        <w:rPr>
-          <w:sz w:val="28"/>
-          <w:szCs w:val="28"/>
-        </w:rPr>
-      </w:pPr>
-    </w:p>
-    <w:p>
-      <w:pPr>
-        <w:rPr>
-          <w:sz w:val="28"/>
-          <w:szCs w:val="28"/>
-        </w:rPr>
-      </w:pPr>
-    </w:p>
-    <w:p>
-      <w:pPr>
-        <w:rPr>
-          <w:sz w:val="28"/>
-          <w:szCs w:val="28"/>
-        </w:rPr>
-      </w:pPr>
-    </w:p>
-    <w:p>
-      <w:pPr>
-        <w:rPr>
-          <w:sz w:val="28"/>
-          <w:szCs w:val="28"/>
-        </w:rPr>
-      </w:pPr>
-    </w:p>
-    <w:p>
-      <w:pPr>
-        <w:rPr>
-          <w:sz w:val="28"/>
-          <w:szCs w:val="28"/>
-        </w:rPr>
-      </w:pPr>
-    </w:p>
-    <w:p>
-      <w:pPr>
-        <w:rPr>
-          <w:sz w:val="28"/>
-          <w:szCs w:val="28"/>
-        </w:rPr>
-      </w:pPr>
-      <w:r>
-        <w:rPr>
-          <w:sz w:val="28"/>
-          <w:szCs w:val="28"/>
-        </w:rPr>
-        <w:drawing>
-          <wp:anchor distT="0" distB="0" distL="114300" distR="114300" simplePos="0" relativeHeight="251669504" behindDoc="0" locked="0" layoutInCell="1" allowOverlap="1" wp14:anchorId="1BC82A39" wp14:editId="69A364FE">
-            <wp:simplePos x="0" y="0"/>
-            <wp:positionH relativeFrom="margin">
-              <wp:align>right</wp:align>
-            </wp:positionH>
-            <wp:positionV relativeFrom="paragraph">
-              <wp:posOffset>878750</wp:posOffset>
-            </wp:positionV>
-            <wp:extent cx="5943600" cy="3947795"/>
-            <wp:effectExtent l="0" t="0" r="0" b="0"/>
-            <wp:wrapNone/>
-            <wp:docPr id="209570618" name="Picture 1"/>
-            <wp:cNvGraphicFramePr>
-              <a:graphicFrameLocks xmlns:a="http://schemas.openxmlformats.org/drawingml/2006/main" noChangeAspect="1"/>
-            </wp:cNvGraphicFramePr>
-            <a:graphic xmlns:a="http://schemas.openxmlformats.org/drawingml/2006/main">
-              <a:graphicData uri="http://schemas.openxmlformats.org/drawingml/2006/picture">
-                <pic:pic xmlns:pic="http://schemas.openxmlformats.org/drawingml/2006/picture">
-                  <pic:nvPicPr>
-                    <pic:cNvPr id="209570618" name=""/>
-                    <pic:cNvPicPr/>
-                  </pic:nvPicPr>
-                  <pic:blipFill>
-                    <a:blip r:embed="rId18">
-                      <a:extLst>
-                        <a:ext uri="{28A0092B-C50C-407E-A947-70E740481C1C}">
-                          <a14:useLocalDpi xmlns:a14="http://schemas.microsoft.com/office/drawing/2010/main" val="0"/>
-                        </a:ext>
-                      </a:extLst>
-                    </a:blip>
-                    <a:stretch>
-                      <a:fillRect/>
-                    </a:stretch>
-                  </pic:blipFill>
-                  <pic:spPr>
-                    <a:xfrm>
-                      <a:off x="0" y="0"/>
-                      <a:ext cx="5943600" cy="3947795"/>
-                    </a:xfrm>
-                    <a:prstGeom prst="rect">
-                      <a:avLst/>
-                    </a:prstGeom>
-                  </pic:spPr>
-                </pic:pic>
-              </a:graphicData>
-            </a:graphic>
-          </wp:anchor>
-        </w:drawing>
-      </w:r>
+    </w:p>
+    <w:p>
+      <w:pPr>
+        <w:rPr>
+          <w:sz w:val="28"/>
+          <w:szCs w:val="28"/>
+        </w:rPr>
+      </w:pPr>
+    </w:p>
+    <w:p>
+      <w:pPr>
+        <w:rPr>
+          <w:sz w:val="28"/>
+          <w:szCs w:val="28"/>
+        </w:rPr>
+      </w:pPr>
+    </w:p>
+    <w:p>
+      <w:pPr>
+        <w:rPr>
+          <w:sz w:val="28"/>
+          <w:szCs w:val="28"/>
+        </w:rPr>
+      </w:pPr>
+    </w:p>
+    <w:p>
+      <w:pPr>
+        <w:rPr>
+          <w:sz w:val="28"/>
+          <w:szCs w:val="28"/>
+        </w:rPr>
+      </w:pPr>
+    </w:p>
+    <w:p>
+      <w:pPr>
+        <w:rPr>
+          <w:sz w:val="28"/>
+          <w:szCs w:val="28"/>
+        </w:rPr>
+      </w:pPr>
+    </w:p>
+    <w:p>
+      <w:pPr>
+        <w:rPr>
+          <w:sz w:val="28"/>
+          <w:szCs w:val="28"/>
+        </w:rPr>
+      </w:pPr>
+    </w:p>
+    <w:p>
+      <w:pPr>
+        <w:rPr>
+          <w:sz w:val="28"/>
+          <w:szCs w:val="28"/>
+        </w:rPr>
+      </w:pPr>
+    </w:p>
+    <w:p>
+      <w:pPr>
+        <w:rPr>
+          <w:sz w:val="28"/>
+          <w:szCs w:val="28"/>
+        </w:rPr>
+      </w:pPr>
+    </w:p>
+    <w:p>
+      <w:pPr>
+        <w:rPr>
+          <w:sz w:val="28"/>
+          <w:szCs w:val="28"/>
+        </w:rPr>
+      </w:pPr>
+    </w:p>
+    <w:p>
+      <w:pPr>
+        <w:rPr>
+          <w:sz w:val="28"/>
+          <w:szCs w:val="28"/>
+        </w:rPr>
+      </w:pPr>
+    </w:p>
+    <w:p>
+      <w:pPr>
+        <w:rPr>
+          <w:sz w:val="28"/>
+          <w:szCs w:val="28"/>
+        </w:rPr>
+      </w:pPr>
+    </w:p>
+    <w:p>
+      <w:pPr>
+        <w:rPr>
+          <w:sz w:val="28"/>
+          <w:szCs w:val="28"/>
+        </w:rPr>
+      </w:pPr>
     </w:p>
     <w:sectPr>
-      <w:headerReference w:type="default" r:id="rId19"/>
+      <w:headerReference w:type="default" r:id="rId15"/>
       <w:pgSz w:w="12240" w:h="15840"/>
       <w:pgMar w:top="1440" w:right="1440" w:bottom="1440" w:left="1440" w:header="720" w:footer="720" w:gutter="0"/>
       <w:cols w:space="720"/>

</xml_diff>